<commit_message>
practiced sql window practical questions
</commit_message>
<xml_diff>
--- a/sql/SQL INTERVIEW QUESTIONS.docx
+++ b/sql/SQL INTERVIEW QUESTIONS.docx
@@ -2372,32 +2372,25 @@
     <w:p/>
     <w:p/>
     <w:p/>
-    <w:p/>
-    <w:p/>
-    <w:p/>
-    <w:p>
-      <w:r>
-        <w:t>Excellent. This is exactly the right approach.</w:t>
-      </w:r>
-    </w:p>
-    <w:p>
-      <w:r>
-        <w:t>Don't just memorize definitions. For interviews, you need to answer in a way that sounds like someone who actually understands databases.</w:t>
-      </w:r>
-    </w:p>
-    <w:p>
-      <w:r>
-        <w:t xml:space="preserve">I'll act as the interviewer and give you the </w:t>
-      </w:r>
-      <w:r>
-        <w:rPr>
-          <w:b/>
-          <w:bCs/>
-        </w:rPr>
-        <w:t>interview-quality answers</w:t>
-      </w:r>
-      <w:r>
-        <w:t xml:space="preserve"> you should know.</w:t>
+    <w:p>
+      <w:pPr>
+        <w:jc w:val="center"/>
+        <w:rPr>
+          <w:b/>
+          <w:bCs/>
+          <w:sz w:val="28"/>
+          <w:szCs w:val="28"/>
+        </w:rPr>
+      </w:pPr>
+      <w:r>
+        <w:rPr>
+          <w:b/>
+          <w:bCs/>
+          <w:sz w:val="28"/>
+          <w:szCs w:val="28"/>
+        </w:rPr>
+        <w:lastRenderedPageBreak/>
+        <w:t>SQL Basics</w:t>
       </w:r>
     </w:p>
     <w:p>
@@ -2550,7 +2543,6 @@
     </w:p>
     <w:p>
       <w:r>
-        <w:lastRenderedPageBreak/>
         <w:pict w14:anchorId="659A18BD">
           <v:rect id="_x0000_i1052" style="width:0;height:1.5pt" o:hralign="center" o:hrstd="t" o:hr="t" fillcolor="#a0a0a0" stroked="f"/>
         </w:pict>
@@ -2630,6 +2622,7 @@
                 <w:b/>
                 <w:bCs/>
               </w:rPr>
+              <w:lastRenderedPageBreak/>
               <w:t>SQL</w:t>
             </w:r>
           </w:p>
@@ -2922,27 +2915,27 @@
     </w:p>
     <w:p>
       <w:r>
+        <w:t>ALTER</w:t>
+      </w:r>
+    </w:p>
+    <w:p>
+      <w:r>
+        <w:t>DROP</w:t>
+      </w:r>
+    </w:p>
+    <w:p>
+      <w:r>
+        <w:t>TRUNCATE</w:t>
+      </w:r>
+    </w:p>
+    <w:p>
+      <w:r>
+        <w:t>Example:</w:t>
+      </w:r>
+    </w:p>
+    <w:p>
+      <w:r>
         <w:lastRenderedPageBreak/>
-        <w:t>ALTER</w:t>
-      </w:r>
-    </w:p>
-    <w:p>
-      <w:r>
-        <w:t>DROP</w:t>
-      </w:r>
-    </w:p>
-    <w:p>
-      <w:r>
-        <w:t>TRUNCATE</w:t>
-      </w:r>
-    </w:p>
-    <w:p>
-      <w:r>
-        <w:t>Example:</w:t>
-      </w:r>
-    </w:p>
-    <w:p>
-      <w:r>
         <w:t>CREATE TABLE Employees(</w:t>
       </w:r>
     </w:p>
@@ -3099,27 +3092,27 @@
     </w:p>
     <w:p>
       <w:r>
+        <w:t>Data Control Language</w:t>
+      </w:r>
+    </w:p>
+    <w:p>
+      <w:r>
+        <w:t>Commands:</w:t>
+      </w:r>
+    </w:p>
+    <w:p>
+      <w:r>
+        <w:t>GRANT</w:t>
+      </w:r>
+    </w:p>
+    <w:p>
+      <w:r>
+        <w:t>REVOKE</w:t>
+      </w:r>
+    </w:p>
+    <w:p>
+      <w:r>
         <w:lastRenderedPageBreak/>
-        <w:t>Data Control Language</w:t>
-      </w:r>
-    </w:p>
-    <w:p>
-      <w:r>
-        <w:t>Commands:</w:t>
-      </w:r>
-    </w:p>
-    <w:p>
-      <w:r>
-        <w:t>GRANT</w:t>
-      </w:r>
-    </w:p>
-    <w:p>
-      <w:r>
-        <w:t>REVOKE</w:t>
-      </w:r>
-    </w:p>
-    <w:p>
-      <w:r>
         <w:t>Used for permissions.</w:t>
       </w:r>
     </w:p>
@@ -3310,7 +3303,6 @@
     </w:p>
     <w:p>
       <w:r>
-        <w:lastRenderedPageBreak/>
         <w:t>All stored in related tables.</w:t>
       </w:r>
     </w:p>
@@ -3353,6 +3345,7 @@
     </w:p>
     <w:p>
       <w:r>
+        <w:lastRenderedPageBreak/>
         <w:t>A table is a database object that stores data in rows and columns.</w:t>
       </w:r>
     </w:p>
@@ -3863,7 +3856,6 @@
     </w:p>
     <w:p>
       <w:r>
-        <w:lastRenderedPageBreak/>
         <w:pict w14:anchorId="3830F189">
           <v:rect id="_x0000_i1065" style="width:0;height:1.5pt" o:hralign="center" o:hrstd="t" o:hr="t" fillcolor="#a0a0a0" stroked="f"/>
         </w:pict>
@@ -3891,6 +3883,7 @@
     </w:p>
     <w:p>
       <w:r>
+        <w:lastRenderedPageBreak/>
         <w:pict w14:anchorId="48AED9C7">
           <v:rect id="_x0000_i1066" style="width:0;height:1.5pt" o:hralign="center" o:hrstd="t" o:hr="t" fillcolor="#a0a0a0" stroked="f"/>
         </w:pict>
@@ -4054,38 +4047,51 @@
       </w:pPr>
     </w:p>
     <w:p>
+      <w:pPr>
+        <w:rPr>
+          <w:b/>
+          <w:bCs/>
+        </w:rPr>
+      </w:pPr>
+    </w:p>
+    <w:p>
+      <w:pPr>
+        <w:jc w:val="center"/>
+        <w:rPr>
+          <w:b/>
+          <w:bCs/>
+          <w:sz w:val="28"/>
+          <w:szCs w:val="28"/>
+        </w:rPr>
+      </w:pPr>
+      <w:r>
+        <w:rPr>
+          <w:b/>
+          <w:bCs/>
+          <w:sz w:val="28"/>
+          <w:szCs w:val="28"/>
+        </w:rPr>
+        <w:t>Keys</w:t>
+      </w:r>
+    </w:p>
+    <w:p>
+      <w:pPr>
+        <w:rPr>
+          <w:b/>
+          <w:bCs/>
+        </w:rPr>
+      </w:pPr>
+      <w:r>
+        <w:rPr>
+          <w:b/>
+          <w:bCs/>
+        </w:rPr>
+        <w:t>8. What is a Primary Key?</w:t>
+      </w:r>
+    </w:p>
+    <w:p>
       <w:r>
         <w:lastRenderedPageBreak/>
-        <w:t xml:space="preserve">Yes. We’ll continue the theory revision from </w:t>
-      </w:r>
-      <w:r>
-        <w:rPr>
-          <w:b/>
-          <w:bCs/>
-        </w:rPr>
-        <w:t>Keys — Questions 8 to 14</w:t>
-      </w:r>
-      <w:r>
-        <w:t xml:space="preserve"> and keep the answers short, interview-ready, and easy to paste into your notes.</w:t>
-      </w:r>
-    </w:p>
-    <w:p>
-      <w:pPr>
-        <w:rPr>
-          <w:b/>
-          <w:bCs/>
-        </w:rPr>
-      </w:pPr>
-      <w:r>
-        <w:rPr>
-          <w:b/>
-          <w:bCs/>
-        </w:rPr>
-        <w:t>8. What is a Primary Key?</w:t>
-      </w:r>
-    </w:p>
-    <w:p>
-      <w:r>
         <w:t xml:space="preserve">A </w:t>
       </w:r>
       <w:r>
@@ -4274,22 +4280,22 @@
     </w:p>
     <w:p>
       <w:r>
+        <w:t xml:space="preserve">    emp_id INT PRIMARY KEY,</w:t>
+      </w:r>
+    </w:p>
+    <w:p>
+      <w:r>
+        <w:t xml:space="preserve">    emp_name VARCHAR(50),</w:t>
+      </w:r>
+    </w:p>
+    <w:p>
+      <w:r>
+        <w:t xml:space="preserve">    dept_id INT,</w:t>
+      </w:r>
+    </w:p>
+    <w:p>
+      <w:r>
         <w:lastRenderedPageBreak/>
-        <w:t xml:space="preserve">    emp_id INT PRIMARY KEY,</w:t>
-      </w:r>
-    </w:p>
-    <w:p>
-      <w:r>
-        <w:t xml:space="preserve">    emp_name VARCHAR(50),</w:t>
-      </w:r>
-    </w:p>
-    <w:p>
-      <w:r>
-        <w:t xml:space="preserve">    dept_id INT,</w:t>
-      </w:r>
-    </w:p>
-    <w:p>
-      <w:r>
         <w:t xml:space="preserve">    FOREIGN KEY (dept_id) REFERENCES departments(dept_id)</w:t>
       </w:r>
     </w:p>
@@ -4637,22 +4643,22 @@
     </w:p>
     <w:p>
       <w:r>
+        <w:t>Neither student_id nor course_id alone is unique, but together:</w:t>
+      </w:r>
+    </w:p>
+    <w:p>
+      <w:r>
+        <w:t>(student_id, course_id)</w:t>
+      </w:r>
+    </w:p>
+    <w:p>
+      <w:r>
+        <w:t>uniquely identify each record.</w:t>
+      </w:r>
+    </w:p>
+    <w:p>
+      <w:r>
         <w:lastRenderedPageBreak/>
-        <w:t>Neither student_id nor course_id alone is unique, but together:</w:t>
-      </w:r>
-    </w:p>
-    <w:p>
-      <w:r>
-        <w:t>(student_id, course_id)</w:t>
-      </w:r>
-    </w:p>
-    <w:p>
-      <w:r>
-        <w:t>uniquely identify each record.</w:t>
-      </w:r>
-    </w:p>
-    <w:p>
-      <w:r>
         <w:t>SQL example:</w:t>
       </w:r>
     </w:p>
@@ -4793,7 +4799,6 @@
           <w:b/>
           <w:bCs/>
         </w:rPr>
-        <w:lastRenderedPageBreak/>
         <w:t>Short interview answer:</w:t>
       </w:r>
       <w:r>
@@ -4820,6 +4825,7 @@
           <w:b/>
           <w:bCs/>
         </w:rPr>
+        <w:lastRenderedPageBreak/>
         <w:t>13. What is a Unique Key?</w:t>
       </w:r>
     </w:p>
@@ -4964,21 +4970,21 @@
     </w:p>
     <w:p>
       <w:r>
+        <w:t>NULL     Rajesh</w:t>
+      </w:r>
+    </w:p>
+    <w:p>
+      <w:r>
+        <w:t>If emp_id is the Primary Key, NULL is not allowed.</w:t>
+      </w:r>
+    </w:p>
+    <w:p>
+      <w:r>
+        <w:rPr>
+          <w:b/>
+          <w:bCs/>
+        </w:rPr>
         <w:lastRenderedPageBreak/>
-        <w:t>NULL     Rajesh</w:t>
-      </w:r>
-    </w:p>
-    <w:p>
-      <w:r>
-        <w:t>If emp_id is the Primary Key, NULL is not allowed.</w:t>
-      </w:r>
-    </w:p>
-    <w:p>
-      <w:r>
-        <w:rPr>
-          <w:b/>
-          <w:bCs/>
-        </w:rPr>
         <w:t>Short interview answer:</w:t>
       </w:r>
       <w:r>
@@ -4997,211 +5003,1088 @@
     </w:p>
     <w:p>
       <w:pPr>
-        <w:rPr>
-          <w:b/>
-          <w:bCs/>
-        </w:rPr>
-      </w:pPr>
-    </w:p>
-    <w:p>
-      <w:pPr>
-        <w:rPr>
-          <w:b/>
-          <w:bCs/>
-        </w:rPr>
-      </w:pPr>
-    </w:p>
-    <w:p>
-      <w:pPr>
-        <w:rPr>
-          <w:b/>
-          <w:bCs/>
-        </w:rPr>
-      </w:pPr>
-    </w:p>
-    <w:p>
-      <w:pPr>
-        <w:rPr>
-          <w:b/>
-          <w:bCs/>
-        </w:rPr>
-      </w:pPr>
-    </w:p>
-    <w:p>
-      <w:pPr>
-        <w:rPr>
-          <w:b/>
-          <w:bCs/>
-        </w:rPr>
-      </w:pPr>
-    </w:p>
-    <w:p>
-      <w:pPr>
-        <w:rPr>
-          <w:b/>
-          <w:bCs/>
-        </w:rPr>
-      </w:pPr>
-    </w:p>
-    <w:p>
-      <w:pPr>
-        <w:rPr>
-          <w:b/>
-          <w:bCs/>
-        </w:rPr>
-      </w:pPr>
-    </w:p>
-    <w:p>
-      <w:pPr>
-        <w:rPr>
-          <w:b/>
-          <w:bCs/>
-        </w:rPr>
-      </w:pPr>
-    </w:p>
-    <w:p>
-      <w:pPr>
-        <w:rPr>
-          <w:b/>
-          <w:bCs/>
-        </w:rPr>
-      </w:pPr>
-    </w:p>
-    <w:p>
-      <w:pPr>
-        <w:rPr>
-          <w:b/>
-          <w:bCs/>
-        </w:rPr>
-      </w:pPr>
-    </w:p>
-    <w:p>
-      <w:pPr>
-        <w:rPr>
-          <w:b/>
-          <w:bCs/>
-        </w:rPr>
-      </w:pPr>
-    </w:p>
-    <w:p>
-      <w:pPr>
-        <w:rPr>
-          <w:b/>
-          <w:bCs/>
-        </w:rPr>
-      </w:pPr>
-    </w:p>
-    <w:p>
-      <w:pPr>
-        <w:rPr>
-          <w:b/>
-          <w:bCs/>
-        </w:rPr>
-      </w:pPr>
-    </w:p>
-    <w:p>
-      <w:pPr>
-        <w:rPr>
-          <w:b/>
-          <w:bCs/>
-        </w:rPr>
-      </w:pPr>
-    </w:p>
-    <w:p>
-      <w:pPr>
-        <w:rPr>
-          <w:b/>
-          <w:bCs/>
-        </w:rPr>
-      </w:pPr>
-    </w:p>
-    <w:p>
-      <w:pPr>
-        <w:rPr>
-          <w:b/>
-          <w:bCs/>
-        </w:rPr>
-      </w:pPr>
-    </w:p>
-    <w:p>
-      <w:pPr>
-        <w:rPr>
-          <w:b/>
-          <w:bCs/>
-        </w:rPr>
-      </w:pPr>
-    </w:p>
-    <w:p>
-      <w:pPr>
-        <w:rPr>
-          <w:b/>
-          <w:bCs/>
-        </w:rPr>
-      </w:pPr>
-    </w:p>
-    <w:p>
-      <w:pPr>
-        <w:rPr>
-          <w:b/>
-          <w:bCs/>
-        </w:rPr>
-      </w:pPr>
-    </w:p>
-    <w:p>
-      <w:pPr>
-        <w:rPr>
-          <w:b/>
-          <w:bCs/>
-        </w:rPr>
-      </w:pPr>
-    </w:p>
-    <w:p>
-      <w:pPr>
-        <w:rPr>
-          <w:b/>
-          <w:bCs/>
-        </w:rPr>
-      </w:pPr>
-    </w:p>
-    <w:p>
-      <w:pPr>
-        <w:rPr>
-          <w:b/>
-          <w:bCs/>
-        </w:rPr>
-      </w:pPr>
-    </w:p>
-    <w:p>
-      <w:pPr>
-        <w:rPr>
-          <w:b/>
-          <w:bCs/>
-        </w:rPr>
-      </w:pPr>
-    </w:p>
-    <w:p>
-      <w:pPr>
-        <w:rPr>
-          <w:b/>
-          <w:bCs/>
-        </w:rPr>
-      </w:pPr>
-    </w:p>
-    <w:p>
-      <w:pPr>
-        <w:rPr>
-          <w:b/>
-          <w:bCs/>
-        </w:rPr>
-      </w:pPr>
-    </w:p>
-    <w:p>
-      <w:pPr>
-        <w:rPr>
-          <w:b/>
-          <w:bCs/>
-        </w:rPr>
-      </w:pPr>
+        <w:jc w:val="center"/>
+        <w:rPr>
+          <w:b/>
+          <w:bCs/>
+          <w:sz w:val="28"/>
+          <w:szCs w:val="28"/>
+        </w:rPr>
+      </w:pPr>
+      <w:r>
+        <w:rPr>
+          <w:b/>
+          <w:bCs/>
+          <w:sz w:val="28"/>
+          <w:szCs w:val="28"/>
+        </w:rPr>
+        <w:t>Constraints</w:t>
+      </w:r>
+    </w:p>
+    <w:p/>
+    <w:p>
+      <w:pPr>
+        <w:rPr>
+          <w:b/>
+          <w:bCs/>
+        </w:rPr>
+      </w:pPr>
+      <w:r>
+        <w:rPr>
+          <w:b/>
+          <w:bCs/>
+        </w:rPr>
+        <w:t>15. What are Constraints?</w:t>
+      </w:r>
+    </w:p>
+    <w:p>
+      <w:r>
+        <w:t>Constraints are rules applied to columns in a table to control what data can be stored and to maintain data accuracy and integrity.</w:t>
+      </w:r>
+    </w:p>
+    <w:p>
+      <w:r>
+        <w:t>Common SQL constraints include:</w:t>
+      </w:r>
+    </w:p>
+    <w:p>
+      <w:pPr>
+        <w:numPr>
+          <w:ilvl w:val="0"/>
+          <w:numId w:val="35"/>
+        </w:numPr>
+      </w:pPr>
+      <w:r>
+        <w:t>PRIMARY KEY</w:t>
+      </w:r>
+    </w:p>
+    <w:p>
+      <w:pPr>
+        <w:numPr>
+          <w:ilvl w:val="0"/>
+          <w:numId w:val="35"/>
+        </w:numPr>
+      </w:pPr>
+      <w:r>
+        <w:t>FOREIGN KEY</w:t>
+      </w:r>
+    </w:p>
+    <w:p>
+      <w:pPr>
+        <w:numPr>
+          <w:ilvl w:val="0"/>
+          <w:numId w:val="35"/>
+        </w:numPr>
+      </w:pPr>
+      <w:r>
+        <w:t>NOT NULL</w:t>
+      </w:r>
+    </w:p>
+    <w:p>
+      <w:pPr>
+        <w:numPr>
+          <w:ilvl w:val="0"/>
+          <w:numId w:val="35"/>
+        </w:numPr>
+      </w:pPr>
+      <w:r>
+        <w:t>UNIQUE</w:t>
+      </w:r>
+    </w:p>
+    <w:p>
+      <w:pPr>
+        <w:numPr>
+          <w:ilvl w:val="0"/>
+          <w:numId w:val="35"/>
+        </w:numPr>
+      </w:pPr>
+      <w:r>
+        <w:t>CHECK</w:t>
+      </w:r>
+    </w:p>
+    <w:p>
+      <w:pPr>
+        <w:numPr>
+          <w:ilvl w:val="0"/>
+          <w:numId w:val="35"/>
+        </w:numPr>
+      </w:pPr>
+      <w:r>
+        <w:t>DEFAULT</w:t>
+      </w:r>
+    </w:p>
+    <w:p>
+      <w:r>
+        <w:t>Example:</w:t>
+      </w:r>
+    </w:p>
+    <w:p>
+      <w:r>
+        <w:t>CREATE TABLE employees (</w:t>
+      </w:r>
+    </w:p>
+    <w:p>
+      <w:r>
+        <w:t xml:space="preserve">    emp_id INT PRIMARY KEY,</w:t>
+      </w:r>
+    </w:p>
+    <w:p>
+      <w:r>
+        <w:t xml:space="preserve">    emp_name VARCHAR(50) NOT NULL,</w:t>
+      </w:r>
+    </w:p>
+    <w:p>
+      <w:r>
+        <w:t xml:space="preserve">    age INT CHECK (age &gt;= 18)</w:t>
+      </w:r>
+    </w:p>
+    <w:p>
+      <w:r>
+        <w:t>);</w:t>
+      </w:r>
+    </w:p>
+    <w:p>
+      <w:pPr>
+        <w:rPr>
+          <w:b/>
+          <w:bCs/>
+        </w:rPr>
+      </w:pPr>
+      <w:r>
+        <w:rPr>
+          <w:b/>
+          <w:bCs/>
+        </w:rPr>
+        <w:t>Short interview answer</w:t>
+      </w:r>
+    </w:p>
+    <w:p>
+      <w:r>
+        <w:t>Constraints are rules applied to table columns to ensure valid, accurate, and consistent data.</w:t>
+      </w:r>
+    </w:p>
+    <w:p>
+      <w:r>
+        <w:pict w14:anchorId="7C904611">
+          <v:rect id="_x0000_i1147" style="width:0;height:1.5pt" o:hralign="center" o:hrstd="t" o:hr="t" fillcolor="#a0a0a0" stroked="f"/>
+        </w:pict>
+      </w:r>
+    </w:p>
+    <w:p>
+      <w:pPr>
+        <w:rPr>
+          <w:b/>
+          <w:bCs/>
+        </w:rPr>
+      </w:pPr>
+      <w:r>
+        <w:rPr>
+          <w:b/>
+          <w:bCs/>
+        </w:rPr>
+        <w:t>16. NOT NULL vs UNIQUE</w:t>
+      </w:r>
+    </w:p>
+    <w:p>
+      <w:pPr>
+        <w:rPr>
+          <w:b/>
+          <w:bCs/>
+        </w:rPr>
+      </w:pPr>
+      <w:r>
+        <w:rPr>
+          <w:b/>
+          <w:bCs/>
+        </w:rPr>
+        <w:t>NOT NULL</w:t>
+      </w:r>
+    </w:p>
+    <w:p>
+      <w:r>
+        <w:t>NOT NULL ensures that a column cannot contain a NULL value.</w:t>
+      </w:r>
+    </w:p>
+    <w:p>
+      <w:r>
+        <w:lastRenderedPageBreak/>
+        <w:t>Example:</w:t>
+      </w:r>
+    </w:p>
+    <w:p>
+      <w:r>
+        <w:t>emp_name VARCHAR(50) NOT NULL</w:t>
+      </w:r>
+    </w:p>
+    <w:p>
+      <w:r>
+        <w:t>This means every employee must have a name.</w:t>
+      </w:r>
+    </w:p>
+    <w:p>
+      <w:pPr>
+        <w:rPr>
+          <w:b/>
+          <w:bCs/>
+        </w:rPr>
+      </w:pPr>
+      <w:r>
+        <w:rPr>
+          <w:b/>
+          <w:bCs/>
+        </w:rPr>
+        <w:t>UNIQUE</w:t>
+      </w:r>
+    </w:p>
+    <w:p>
+      <w:r>
+        <w:t>UNIQUE ensures that duplicate values are not allowed in a column or combination of columns.</w:t>
+      </w:r>
+    </w:p>
+    <w:p>
+      <w:r>
+        <w:t>Example:</w:t>
+      </w:r>
+    </w:p>
+    <w:p>
+      <w:r>
+        <w:t>email VARCHAR(100) UNIQUE</w:t>
+      </w:r>
+    </w:p>
+    <w:p>
+      <w:r>
+        <w:t>This means two employees cannot have the same email.</w:t>
+      </w:r>
+    </w:p>
+    <w:p>
+      <w:pPr>
+        <w:rPr>
+          <w:b/>
+          <w:bCs/>
+        </w:rPr>
+      </w:pPr>
+      <w:r>
+        <w:rPr>
+          <w:b/>
+          <w:bCs/>
+        </w:rPr>
+        <w:t>Difference</w:t>
+      </w:r>
+    </w:p>
+    <w:tbl>
+      <w:tblPr>
+        <w:tblW w:w="0" w:type="auto"/>
+        <w:tblCellSpacing w:w="15" w:type="dxa"/>
+        <w:tblCellMar>
+          <w:top w:w="15" w:type="dxa"/>
+          <w:left w:w="15" w:type="dxa"/>
+          <w:bottom w:w="15" w:type="dxa"/>
+          <w:right w:w="15" w:type="dxa"/>
+        </w:tblCellMar>
+        <w:tblLook w:val="04A0" w:firstRow="1" w:lastRow="0" w:firstColumn="1" w:lastColumn="0" w:noHBand="0" w:noVBand="1"/>
+      </w:tblPr>
+      <w:tblGrid>
+        <w:gridCol w:w="4792"/>
+        <w:gridCol w:w="3523"/>
+      </w:tblGrid>
+      <w:tr>
+        <w:trPr>
+          <w:tblHeader/>
+          <w:tblCellSpacing w:w="15" w:type="dxa"/>
+        </w:trPr>
+        <w:tc>
+          <w:tcPr>
+            <w:tcW w:w="0" w:type="auto"/>
+            <w:vAlign w:val="center"/>
+            <w:hideMark/>
+          </w:tcPr>
+          <w:p>
+            <w:pPr>
+              <w:rPr>
+                <w:b/>
+                <w:bCs/>
+              </w:rPr>
+            </w:pPr>
+            <w:r>
+              <w:rPr>
+                <w:b/>
+                <w:bCs/>
+              </w:rPr>
+              <w:t>NOT NULL</w:t>
+            </w:r>
+          </w:p>
+        </w:tc>
+        <w:tc>
+          <w:tcPr>
+            <w:tcW w:w="0" w:type="auto"/>
+            <w:vAlign w:val="center"/>
+            <w:hideMark/>
+          </w:tcPr>
+          <w:p>
+            <w:pPr>
+              <w:rPr>
+                <w:b/>
+                <w:bCs/>
+              </w:rPr>
+            </w:pPr>
+            <w:r>
+              <w:rPr>
+                <w:b/>
+                <w:bCs/>
+              </w:rPr>
+              <w:t>UNIQUE</w:t>
+            </w:r>
+          </w:p>
+        </w:tc>
+      </w:tr>
+      <w:tr>
+        <w:trPr>
+          <w:tblCellSpacing w:w="15" w:type="dxa"/>
+        </w:trPr>
+        <w:tc>
+          <w:tcPr>
+            <w:tcW w:w="0" w:type="auto"/>
+            <w:vAlign w:val="center"/>
+            <w:hideMark/>
+          </w:tcPr>
+          <w:p>
+            <w:r>
+              <w:t>Prevents NULL values</w:t>
+            </w:r>
+          </w:p>
+        </w:tc>
+        <w:tc>
+          <w:tcPr>
+            <w:tcW w:w="0" w:type="auto"/>
+            <w:vAlign w:val="center"/>
+            <w:hideMark/>
+          </w:tcPr>
+          <w:p>
+            <w:r>
+              <w:t>Prevents duplicate values</w:t>
+            </w:r>
+          </w:p>
+        </w:tc>
+      </w:tr>
+      <w:tr>
+        <w:trPr>
+          <w:tblCellSpacing w:w="15" w:type="dxa"/>
+        </w:trPr>
+        <w:tc>
+          <w:tcPr>
+            <w:tcW w:w="0" w:type="auto"/>
+            <w:vAlign w:val="center"/>
+            <w:hideMark/>
+          </w:tcPr>
+          <w:p>
+            <w:r>
+              <w:t>Same non-NULL value can appear multiple times</w:t>
+            </w:r>
+          </w:p>
+        </w:tc>
+        <w:tc>
+          <w:tcPr>
+            <w:tcW w:w="0" w:type="auto"/>
+            <w:vAlign w:val="center"/>
+            <w:hideMark/>
+          </w:tcPr>
+          <w:p>
+            <w:r>
+              <w:t>Same value cannot normally repeat</w:t>
+            </w:r>
+          </w:p>
+        </w:tc>
+      </w:tr>
+      <w:tr>
+        <w:trPr>
+          <w:tblCellSpacing w:w="15" w:type="dxa"/>
+        </w:trPr>
+        <w:tc>
+          <w:tcPr>
+            <w:tcW w:w="0" w:type="auto"/>
+            <w:vAlign w:val="center"/>
+            <w:hideMark/>
+          </w:tcPr>
+          <w:p>
+            <w:r>
+              <w:t>Focuses on presence of data</w:t>
+            </w:r>
+          </w:p>
+        </w:tc>
+        <w:tc>
+          <w:tcPr>
+            <w:tcW w:w="0" w:type="auto"/>
+            <w:vAlign w:val="center"/>
+            <w:hideMark/>
+          </w:tcPr>
+          <w:p>
+            <w:r>
+              <w:t>Focuses on uniqueness of data</w:t>
+            </w:r>
+          </w:p>
+        </w:tc>
+      </w:tr>
+    </w:tbl>
+    <w:p>
+      <w:pPr>
+        <w:rPr>
+          <w:b/>
+          <w:bCs/>
+        </w:rPr>
+      </w:pPr>
+      <w:r>
+        <w:rPr>
+          <w:b/>
+          <w:bCs/>
+        </w:rPr>
+        <w:t>Short interview answer</w:t>
+      </w:r>
+    </w:p>
+    <w:p>
+      <w:r>
+        <w:t>NOT NULL prevents missing values, whereas UNIQUE prevents duplicate values.</w:t>
+      </w:r>
+    </w:p>
+    <w:p>
+      <w:r>
+        <w:pict w14:anchorId="45DCFB21">
+          <v:rect id="_x0000_i1148" style="width:0;height:1.5pt" o:hralign="center" o:hrstd="t" o:hr="t" fillcolor="#a0a0a0" stroked="f"/>
+        </w:pict>
+      </w:r>
+    </w:p>
+    <w:p>
+      <w:pPr>
+        <w:rPr>
+          <w:b/>
+          <w:bCs/>
+        </w:rPr>
+      </w:pPr>
+      <w:r>
+        <w:rPr>
+          <w:b/>
+          <w:bCs/>
+        </w:rPr>
+        <w:t>17. What is a CHECK Constraint?</w:t>
+      </w:r>
+    </w:p>
+    <w:p>
+      <w:r>
+        <w:t>A CHECK constraint is used to restrict the values that can be inserted into a column based on a condition.</w:t>
+      </w:r>
+    </w:p>
+    <w:p>
+      <w:r>
+        <w:t>Example:</w:t>
+      </w:r>
+    </w:p>
+    <w:p>
+      <w:r>
+        <w:t>CREATE TABLE employees (</w:t>
+      </w:r>
+    </w:p>
+    <w:p>
+      <w:r>
+        <w:t xml:space="preserve">    emp_id INT,</w:t>
+      </w:r>
+    </w:p>
+    <w:p>
+      <w:r>
+        <w:t xml:space="preserve">    age INT CHECK (age &gt;= 18)</w:t>
+      </w:r>
+    </w:p>
+    <w:p>
+      <w:r>
+        <w:t>);</w:t>
+      </w:r>
+    </w:p>
+    <w:p>
+      <w:r>
+        <w:t>This prevents values such as:</w:t>
+      </w:r>
+    </w:p>
+    <w:p>
+      <w:r>
+        <w:t>age = 15</w:t>
+      </w:r>
+    </w:p>
+    <w:p>
+      <w:r>
+        <w:t>from being inserted.</w:t>
+      </w:r>
+    </w:p>
+    <w:p>
+      <w:r>
+        <w:lastRenderedPageBreak/>
+        <w:t>Another example:</w:t>
+      </w:r>
+    </w:p>
+    <w:p>
+      <w:r>
+        <w:t>salary INT CHECK (salary &gt; 0)</w:t>
+      </w:r>
+    </w:p>
+    <w:p>
+      <w:pPr>
+        <w:rPr>
+          <w:b/>
+          <w:bCs/>
+        </w:rPr>
+      </w:pPr>
+      <w:r>
+        <w:rPr>
+          <w:b/>
+          <w:bCs/>
+        </w:rPr>
+        <w:t>Short interview answer</w:t>
+      </w:r>
+    </w:p>
+    <w:p>
+      <w:r>
+        <w:t>A CHECK constraint ensures that values in a column satisfy a specified condition before they are accepted.</w:t>
+      </w:r>
+    </w:p>
+    <w:p>
+      <w:r>
+        <w:pict w14:anchorId="499AEBB1">
+          <v:rect id="_x0000_i1149" style="width:0;height:1.5pt" o:hralign="center" o:hrstd="t" o:hr="t" fillcolor="#a0a0a0" stroked="f"/>
+        </w:pict>
+      </w:r>
+    </w:p>
+    <w:p>
+      <w:pPr>
+        <w:rPr>
+          <w:b/>
+          <w:bCs/>
+        </w:rPr>
+      </w:pPr>
+      <w:r>
+        <w:rPr>
+          <w:b/>
+          <w:bCs/>
+        </w:rPr>
+        <w:t>18. What is a DEFAULT Constraint?</w:t>
+      </w:r>
+    </w:p>
+    <w:p>
+      <w:r>
+        <w:t>A DEFAULT constraint provides a predefined value for a column when no value is supplied during insertion.</w:t>
+      </w:r>
+    </w:p>
+    <w:p>
+      <w:r>
+        <w:t>Example:</w:t>
+      </w:r>
+    </w:p>
+    <w:p>
+      <w:r>
+        <w:t>CREATE TABLE employees (</w:t>
+      </w:r>
+    </w:p>
+    <w:p>
+      <w:r>
+        <w:t xml:space="preserve">    emp_id INT,</w:t>
+      </w:r>
+    </w:p>
+    <w:p>
+      <w:r>
+        <w:t xml:space="preserve">    emp_name VARCHAR(50),</w:t>
+      </w:r>
+    </w:p>
+    <w:p>
+      <w:r>
+        <w:t xml:space="preserve">    status VARCHAR(20) DEFAULT 'Active'</w:t>
+      </w:r>
+    </w:p>
+    <w:p>
+      <w:r>
+        <w:t>);</w:t>
+      </w:r>
+    </w:p>
+    <w:p>
+      <w:r>
+        <w:t>If you insert:</w:t>
+      </w:r>
+    </w:p>
+    <w:p>
+      <w:r>
+        <w:t>INSERT INTO employees(emp_id, emp_name)</w:t>
+      </w:r>
+    </w:p>
+    <w:p>
+      <w:r>
+        <w:t>VALUES (101, 'Mohan');</w:t>
+      </w:r>
+    </w:p>
+    <w:p>
+      <w:r>
+        <w:t>then status automatically becomes:</w:t>
+      </w:r>
+    </w:p>
+    <w:p>
+      <w:r>
+        <w:t>Active</w:t>
+      </w:r>
+    </w:p>
+    <w:p>
+      <w:pPr>
+        <w:rPr>
+          <w:b/>
+          <w:bCs/>
+        </w:rPr>
+      </w:pPr>
+      <w:r>
+        <w:rPr>
+          <w:b/>
+          <w:bCs/>
+        </w:rPr>
+        <w:t>Short interview answer</w:t>
+      </w:r>
+    </w:p>
+    <w:p>
+      <w:r>
+        <w:t>A DEFAULT constraint automatically assigns a predefined value to a column when no value is provided.</w:t>
+      </w:r>
+    </w:p>
+    <w:p>
+      <w:r>
+        <w:pict w14:anchorId="5750C2CF">
+          <v:rect id="_x0000_i1150" style="width:0;height:1.5pt" o:hralign="center" o:hrstd="t" o:hr="t" fillcolor="#a0a0a0" stroked="f"/>
+        </w:pict>
+      </w:r>
+    </w:p>
+    <w:p>
+      <w:pPr>
+        <w:rPr>
+          <w:b/>
+          <w:bCs/>
+        </w:rPr>
+      </w:pPr>
+      <w:r>
+        <w:rPr>
+          <w:b/>
+          <w:bCs/>
+        </w:rPr>
+        <w:t>19. What is AUTO_INCREMENT?</w:t>
+      </w:r>
+    </w:p>
+    <w:p>
+      <w:r>
+        <w:t>AUTO_INCREMENT automatically generates a new numeric value for a column whenever a new row is inserted.</w:t>
+      </w:r>
+    </w:p>
+    <w:p>
+      <w:r>
+        <w:t>It is commonly used for ID columns.</w:t>
+      </w:r>
+    </w:p>
+    <w:p>
+      <w:r>
+        <w:t>Example in MySQL:</w:t>
+      </w:r>
+    </w:p>
+    <w:p>
+      <w:r>
+        <w:lastRenderedPageBreak/>
+        <w:t>CREATE TABLE employees (</w:t>
+      </w:r>
+    </w:p>
+    <w:p>
+      <w:r>
+        <w:t xml:space="preserve">    emp_id INT AUTO_INCREMENT PRIMARY KEY,</w:t>
+      </w:r>
+    </w:p>
+    <w:p>
+      <w:r>
+        <w:t xml:space="preserve">    emp_name VARCHAR(50)</w:t>
+      </w:r>
+    </w:p>
+    <w:p>
+      <w:r>
+        <w:t>);</w:t>
+      </w:r>
+    </w:p>
+    <w:p>
+      <w:r>
+        <w:t>Then:</w:t>
+      </w:r>
+    </w:p>
+    <w:p>
+      <w:r>
+        <w:t>INSERT INTO employees(emp_name)</w:t>
+      </w:r>
+    </w:p>
+    <w:p>
+      <w:r>
+        <w:t>VALUES ('Mohan');</w:t>
+      </w:r>
+    </w:p>
+    <w:p>
+      <w:r>
+        <w:t>SQL automatically generates:</w:t>
+      </w:r>
+    </w:p>
+    <w:p>
+      <w:r>
+        <w:t>emp_id = 1</w:t>
+      </w:r>
+    </w:p>
+    <w:p>
+      <w:r>
+        <w:t>and the next inserted employee may get:</w:t>
+      </w:r>
+    </w:p>
+    <w:p>
+      <w:r>
+        <w:t>emp_id = 2</w:t>
+      </w:r>
+    </w:p>
+    <w:p>
+      <w:pPr>
+        <w:rPr>
+          <w:b/>
+          <w:bCs/>
+        </w:rPr>
+      </w:pPr>
+      <w:r>
+        <w:rPr>
+          <w:b/>
+          <w:bCs/>
+        </w:rPr>
+        <w:t>Important interview note</w:t>
+      </w:r>
+    </w:p>
+    <w:p>
+      <w:r>
+        <w:t xml:space="preserve">AUTO_INCREMENT is </w:t>
+      </w:r>
+      <w:r>
+        <w:rPr>
+          <w:b/>
+          <w:bCs/>
+        </w:rPr>
+        <w:t>database-specific syntax</w:t>
+      </w:r>
+      <w:r>
+        <w:t>.</w:t>
+      </w:r>
+    </w:p>
+    <w:p>
+      <w:r>
+        <w:t>For example:</w:t>
+      </w:r>
+    </w:p>
+    <w:p>
+      <w:r>
+        <w:t>MySQL      → AUTO_INCREMENT</w:t>
+      </w:r>
+    </w:p>
+    <w:p>
+      <w:r>
+        <w:t>SQL Server → IDENTITY</w:t>
+      </w:r>
+    </w:p>
+    <w:p>
+      <w:r>
+        <w:t>PostgreSQL → GENERATED ... AS IDENTITY</w:t>
+      </w:r>
+    </w:p>
+    <w:p>
+      <w:r>
+        <w:t>So the concept is the same, but the syntax differs.</w:t>
+      </w:r>
+    </w:p>
+    <w:p>
+      <w:pPr>
+        <w:rPr>
+          <w:b/>
+          <w:bCs/>
+        </w:rPr>
+      </w:pPr>
+      <w:r>
+        <w:rPr>
+          <w:b/>
+          <w:bCs/>
+        </w:rPr>
+        <w:t>Short interview answer</w:t>
+      </w:r>
+    </w:p>
+    <w:p>
+      <w:r>
+        <w:t>AUTO_INCREMENT automatically generates sequential numeric values for a column, usually for a primary key, whenever new rows are inserted.</w:t>
+      </w:r>
+    </w:p>
+    <w:p>
+      <w:r>
+        <w:t>A very useful memory line for these five is:</w:t>
+      </w:r>
+    </w:p>
+    <w:p>
+      <w:r>
+        <w:t>Constraint   Purpose</w:t>
+      </w:r>
+    </w:p>
+    <w:p>
+      <w:r>
+        <w:t>NOT NULL     No missing value</w:t>
+      </w:r>
+    </w:p>
+    <w:p>
+      <w:r>
+        <w:t>UNIQUE       No duplicate value</w:t>
+      </w:r>
+    </w:p>
+    <w:p>
+      <w:r>
+        <w:t>CHECK        Value must satisfy condition</w:t>
+      </w:r>
+    </w:p>
+    <w:p>
+      <w:r>
+        <w:t>DEFAULT      Use predefined value</w:t>
+      </w:r>
+    </w:p>
+    <w:p>
+      <w:r>
+        <w:t>AUTO_INCREMENT  Generate ID automatically</w:t>
+      </w:r>
+    </w:p>
+    <w:p/>
+    <w:p>
+      <w:pPr>
+        <w:rPr>
+          <w:b/>
+          <w:bCs/>
+        </w:rPr>
+      </w:pPr>
+    </w:p>
+    <w:p>
+      <w:pPr>
+        <w:rPr>
+          <w:b/>
+          <w:bCs/>
+        </w:rPr>
+      </w:pPr>
+    </w:p>
+    <w:p>
+      <w:pPr>
+        <w:rPr>
+          <w:b/>
+          <w:bCs/>
+        </w:rPr>
+      </w:pPr>
+    </w:p>
+    <w:p>
+      <w:pPr>
+        <w:rPr>
+          <w:b/>
+          <w:bCs/>
+        </w:rPr>
+      </w:pPr>
+    </w:p>
+    <w:p>
+      <w:pPr>
+        <w:rPr>
+          <w:b/>
+          <w:bCs/>
+        </w:rPr>
+      </w:pPr>
+    </w:p>
+    <w:p>
+      <w:pPr>
+        <w:rPr>
+          <w:b/>
+          <w:bCs/>
+        </w:rPr>
+      </w:pPr>
+    </w:p>
+    <w:p>
+      <w:pPr>
+        <w:rPr>
+          <w:b/>
+          <w:bCs/>
+        </w:rPr>
+      </w:pPr>
+    </w:p>
+    <w:p>
+      <w:pPr>
+        <w:rPr>
+          <w:b/>
+          <w:bCs/>
+        </w:rPr>
+      </w:pPr>
+    </w:p>
+    <w:p>
+      <w:pPr>
+        <w:rPr>
+          <w:b/>
+          <w:bCs/>
+        </w:rPr>
+      </w:pPr>
+    </w:p>
+    <w:p>
+      <w:pPr>
+        <w:rPr>
+          <w:b/>
+          <w:bCs/>
+        </w:rPr>
+      </w:pPr>
+    </w:p>
+    <w:p>
+      <w:pPr>
+        <w:rPr>
+          <w:b/>
+          <w:bCs/>
+        </w:rPr>
+      </w:pPr>
+    </w:p>
+    <w:p>
+      <w:pPr>
+        <w:rPr>
+          <w:b/>
+          <w:bCs/>
+        </w:rPr>
+      </w:pPr>
+    </w:p>
+    <w:p>
+      <w:pPr>
+        <w:rPr>
+          <w:b/>
+          <w:bCs/>
+        </w:rPr>
+      </w:pPr>
+    </w:p>
+    <w:p>
+      <w:pPr>
+        <w:rPr>
+          <w:b/>
+          <w:bCs/>
+        </w:rPr>
+      </w:pPr>
+    </w:p>
+    <w:p>
+      <w:pPr>
+        <w:rPr>
+          <w:b/>
+          <w:bCs/>
+        </w:rPr>
+      </w:pPr>
+    </w:p>
+    <w:p>
+      <w:pPr>
+        <w:rPr>
+          <w:b/>
+          <w:bCs/>
+        </w:rPr>
+      </w:pPr>
+    </w:p>
+    <w:p>
+      <w:pPr>
+        <w:rPr>
+          <w:b/>
+          <w:bCs/>
+        </w:rPr>
+      </w:pPr>
+    </w:p>
+    <w:p>
+      <w:pPr>
+        <w:rPr>
+          <w:b/>
+          <w:bCs/>
+        </w:rPr>
+      </w:pPr>
+    </w:p>
+    <w:p>
+      <w:pPr>
+        <w:rPr>
+          <w:b/>
+          <w:bCs/>
+        </w:rPr>
+      </w:pPr>
+    </w:p>
+    <w:p>
+      <w:pPr>
+        <w:rPr>
+          <w:b/>
+          <w:bCs/>
+        </w:rPr>
+      </w:pPr>
+    </w:p>
+    <w:p>
+      <w:pPr>
+        <w:rPr>
+          <w:b/>
+          <w:bCs/>
+        </w:rPr>
+      </w:pPr>
+    </w:p>
+    <w:p>
+      <w:pPr>
+        <w:rPr>
+          <w:b/>
+          <w:bCs/>
+        </w:rPr>
+      </w:pPr>
+    </w:p>
+    <w:p>
+      <w:pPr>
+        <w:rPr>
+          <w:b/>
+          <w:bCs/>
+        </w:rPr>
+      </w:pPr>
+    </w:p>
+    <w:p>
+      <w:pPr>
+        <w:rPr>
+          <w:b/>
+          <w:bCs/>
+        </w:rPr>
+      </w:pPr>
+    </w:p>
+    <w:p>
+      <w:pPr>
+        <w:rPr>
+          <w:b/>
+          <w:bCs/>
+        </w:rPr>
+      </w:pPr>
+    </w:p>
+    <w:p>
+      <w:pPr>
+        <w:rPr>
+          <w:b/>
+          <w:bCs/>
+        </w:rPr>
+      </w:pPr>
+    </w:p>
+    <w:p>
+      <w:pPr>
+        <w:rPr>
+          <w:b/>
+          <w:bCs/>
+        </w:rPr>
+      </w:pPr>
+    </w:p>
+    <w:p>
+      <w:pPr>
+        <w:jc w:val="center"/>
+        <w:rPr>
+          <w:b/>
+          <w:bCs/>
+          <w:sz w:val="28"/>
+          <w:szCs w:val="28"/>
+        </w:rPr>
+      </w:pPr>
+      <w:r>
+        <w:rPr>
+          <w:b/>
+          <w:bCs/>
+          <w:sz w:val="28"/>
+          <w:szCs w:val="28"/>
+        </w:rPr>
+        <w:lastRenderedPageBreak/>
+        <w:t>Window Functions</w:t>
+      </w:r>
     </w:p>
     <w:p>
       <w:pPr>
@@ -5491,41 +6374,41 @@
           <w:b/>
           <w:bCs/>
         </w:rPr>
+        <w:t>What is ROW_NUMBER()?</w:t>
+      </w:r>
+    </w:p>
+    <w:p>
+      <w:pPr>
+        <w:pStyle w:val="ListParagraph"/>
+      </w:pPr>
+    </w:p>
+    <w:p>
+      <w:pPr>
+        <w:pStyle w:val="ListParagraph"/>
+      </w:pPr>
+      <w:r>
+        <w:t xml:space="preserve">ROW_NUMBER() is a window function that assigns a </w:t>
+      </w:r>
+      <w:r>
+        <w:rPr>
+          <w:b/>
+          <w:bCs/>
+        </w:rPr>
+        <w:t>unique sequential number to each row</w:t>
+      </w:r>
+      <w:r>
+        <w:t xml:space="preserve"> based on the order specified inside the OVER() clause.</w:t>
+      </w:r>
+    </w:p>
+    <w:p>
+      <w:pPr>
+        <w:pStyle w:val="ListParagraph"/>
+      </w:pPr>
+      <w:r>
+        <w:rPr>
+          <w:highlight w:val="yellow"/>
+        </w:rPr>
         <w:lastRenderedPageBreak/>
-        <w:t>What is ROW_NUMBER()?</w:t>
-      </w:r>
-    </w:p>
-    <w:p>
-      <w:pPr>
-        <w:pStyle w:val="ListParagraph"/>
-      </w:pPr>
-    </w:p>
-    <w:p>
-      <w:pPr>
-        <w:pStyle w:val="ListParagraph"/>
-      </w:pPr>
-      <w:r>
-        <w:t xml:space="preserve">ROW_NUMBER() is a window function that assigns a </w:t>
-      </w:r>
-      <w:r>
-        <w:rPr>
-          <w:b/>
-          <w:bCs/>
-        </w:rPr>
-        <w:t>unique sequential number to each row</w:t>
-      </w:r>
-      <w:r>
-        <w:t xml:space="preserve"> based on the order specified inside the OVER() clause.</w:t>
-      </w:r>
-    </w:p>
-    <w:p>
-      <w:pPr>
-        <w:pStyle w:val="ListParagraph"/>
-      </w:pPr>
-      <w:r>
-        <w:rPr>
-          <w:highlight w:val="yellow"/>
-        </w:rPr>
         <w:t>Even if two rows have the same value, ROW_NUMBER() still gives them different numbers.</w:t>
       </w:r>
     </w:p>
@@ -5748,29 +6631,29 @@
         <w:ind w:left="720"/>
       </w:pPr>
       <w:r>
+        <w:t>SELECT *,RANK() OVER(partition by dept_name order by salary</w:t>
+      </w:r>
+      <w:r>
+        <w:t xml:space="preserve"> desc</w:t>
+      </w:r>
+      <w:r>
+        <w:t>) AS rnk FROM employees</w:t>
+      </w:r>
+    </w:p>
+    <w:p>
+      <w:pPr>
+        <w:ind w:left="720"/>
+      </w:pPr>
+    </w:p>
+    <w:p>
+      <w:pPr>
+        <w:ind w:left="720"/>
+      </w:pPr>
+      <w:r>
+        <w:rPr>
+          <w:noProof/>
+        </w:rPr>
         <w:lastRenderedPageBreak/>
-        <w:t>SELECT *,RANK() OVER(partition by dept_name order by salary</w:t>
-      </w:r>
-      <w:r>
-        <w:t xml:space="preserve"> desc</w:t>
-      </w:r>
-      <w:r>
-        <w:t>) AS rnk FROM employees</w:t>
-      </w:r>
-    </w:p>
-    <w:p>
-      <w:pPr>
-        <w:ind w:left="720"/>
-      </w:pPr>
-    </w:p>
-    <w:p>
-      <w:pPr>
-        <w:ind w:left="720"/>
-      </w:pPr>
-      <w:r>
-        <w:rPr>
-          <w:noProof/>
-        </w:rPr>
         <w:drawing>
           <wp:inline distT="0" distB="0" distL="0" distR="0" wp14:anchorId="4CA2C9F1" wp14:editId="1C29FC3E">
             <wp:extent cx="2908449" cy="1670136"/>
@@ -5947,7 +6830,6 @@
         <w:rPr>
           <w:noProof/>
         </w:rPr>
-        <w:lastRenderedPageBreak/>
         <w:drawing>
           <wp:inline distT="0" distB="0" distL="0" distR="0" wp14:anchorId="13B854B7" wp14:editId="62701E5E">
             <wp:extent cx="2889250" cy="1574800"/>
@@ -6003,6 +6885,7 @@
           <w:b/>
           <w:bCs/>
         </w:rPr>
+        <w:lastRenderedPageBreak/>
         <w:t>Short interview answer</w:t>
       </w:r>
     </w:p>
@@ -6150,7 +7033,9 @@
         <w:jc w:val="both"/>
       </w:pPr>
       <w:r>
-        <w:lastRenderedPageBreak/>
+        <w:rPr>
+          <w:noProof/>
+        </w:rPr>
         <w:drawing>
           <wp:inline distT="0" distB="0" distL="0" distR="0" wp14:anchorId="2DB7888E" wp14:editId="74FE87B3">
             <wp:extent cx="3486329" cy="1492327"/>
@@ -6229,6 +7114,7 @@
         <w:jc w:val="both"/>
       </w:pPr>
       <w:r>
+        <w:lastRenderedPageBreak/>
         <w:t>OVER(</w:t>
       </w:r>
     </w:p>
@@ -6301,6 +7187,9 @@
         <w:jc w:val="both"/>
       </w:pPr>
       <w:r>
+        <w:rPr>
+          <w:noProof/>
+        </w:rPr>
         <w:drawing>
           <wp:inline distT="0" distB="0" distL="0" distR="0" wp14:anchorId="4D1AAF41" wp14:editId="13C23C10">
             <wp:extent cx="3600635" cy="1517728"/>
@@ -6395,22 +7284,85 @@
           <w:b/>
           <w:bCs/>
         </w:rPr>
+        <w:t>What is LEAD()?</w:t>
+      </w:r>
+    </w:p>
+    <w:p>
+      <w:pPr>
+        <w:ind w:left="360"/>
+      </w:pPr>
+      <w:r>
+        <w:t xml:space="preserve">LEAD() is a SQL window function used to access the value of a </w:t>
+      </w:r>
+      <w:r>
+        <w:rPr>
+          <w:b/>
+          <w:bCs/>
+        </w:rPr>
+        <w:t>subsequent or next row</w:t>
+      </w:r>
+      <w:r>
+        <w:t xml:space="preserve"> from the current row, without using a self join.</w:t>
+      </w:r>
+    </w:p>
+    <w:p>
+      <w:pPr>
+        <w:ind w:left="360"/>
+      </w:pPr>
+      <w:r>
+        <w:t>It works according to the ordering specified inside the OVER() clause and can also use an offset to look multiple rows ahead.</w:t>
+      </w:r>
+    </w:p>
+    <w:p>
+      <w:pPr>
+        <w:ind w:left="360"/>
+      </w:pPr>
+      <w:r>
+        <w:t>Example:</w:t>
+      </w:r>
+    </w:p>
+    <w:p>
+      <w:pPr>
+        <w:ind w:left="360"/>
+      </w:pPr>
+      <w:r>
+        <w:t>SELECT *,</w:t>
+      </w:r>
+    </w:p>
+    <w:p>
+      <w:pPr>
+        <w:ind w:left="360"/>
+      </w:pPr>
+      <w:r>
+        <w:t xml:space="preserve">       LEAD(salary) OVER(</w:t>
+      </w:r>
+    </w:p>
+    <w:p>
+      <w:pPr>
+        <w:ind w:left="360"/>
+      </w:pPr>
+      <w:r>
+        <w:t xml:space="preserve">           PARTITION BY dept_name</w:t>
+      </w:r>
+    </w:p>
+    <w:p>
+      <w:pPr>
+        <w:ind w:left="360"/>
+      </w:pPr>
+      <w:r>
+        <w:t xml:space="preserve">           ORDER BY </w:t>
+      </w:r>
+      <w:r>
+        <w:t>emp_id</w:t>
+      </w:r>
+    </w:p>
+    <w:p>
+      <w:pPr>
+        <w:ind w:left="360"/>
+      </w:pPr>
+      <w:r>
         <w:lastRenderedPageBreak/>
-        <w:t xml:space="preserve">What is </w:t>
-      </w:r>
-      <w:r>
-        <w:rPr>
-          <w:b/>
-          <w:bCs/>
-        </w:rPr>
-        <w:t>LEAD</w:t>
-      </w:r>
-      <w:r>
-        <w:rPr>
-          <w:b/>
-          <w:bCs/>
-        </w:rPr>
-        <w:t>()?</w:t>
+        <w:t xml:space="preserve">       ) AS next_emp_salary</w:t>
       </w:r>
     </w:p>
     <w:p>
@@ -6418,17 +7370,7 @@
         <w:ind w:left="360"/>
       </w:pPr>
       <w:r>
-        <w:t xml:space="preserve">LEAD() is a SQL window function used to access the value of a </w:t>
-      </w:r>
-      <w:r>
-        <w:rPr>
-          <w:b/>
-          <w:bCs/>
-        </w:rPr>
-        <w:t>subsequent or next row</w:t>
-      </w:r>
-      <w:r>
-        <w:t xml:space="preserve"> from the current row, without using a self join.</w:t>
+        <w:t>FROM employees;</w:t>
       </w:r>
     </w:p>
     <w:p>
@@ -6436,7 +7378,7 @@
         <w:ind w:left="360"/>
       </w:pPr>
       <w:r>
-        <w:t>It works according to the ordering specified inside the OVER() clause and can also use an offset to look multiple rows ahead.</w:t>
+        <w:t>Here, LEAD(salary) returns the salary of the next employee within the same department based on salary order.</w:t>
       </w:r>
     </w:p>
     <w:p>
@@ -6444,73 +7386,9 @@
         <w:ind w:left="360"/>
       </w:pPr>
       <w:r>
-        <w:t>Example:</w:t>
-      </w:r>
-    </w:p>
-    <w:p>
-      <w:pPr>
-        <w:ind w:left="360"/>
-      </w:pPr>
-      <w:r>
-        <w:t>SELECT *,</w:t>
-      </w:r>
-    </w:p>
-    <w:p>
-      <w:pPr>
-        <w:ind w:left="360"/>
-      </w:pPr>
-      <w:r>
-        <w:t xml:space="preserve">       LEAD(salary) OVER(</w:t>
-      </w:r>
-    </w:p>
-    <w:p>
-      <w:pPr>
-        <w:ind w:left="360"/>
-      </w:pPr>
-      <w:r>
-        <w:t xml:space="preserve">           PARTITION BY dept_name</w:t>
-      </w:r>
-    </w:p>
-    <w:p>
-      <w:pPr>
-        <w:ind w:left="360"/>
-      </w:pPr>
-      <w:r>
-        <w:t xml:space="preserve">           ORDER BY </w:t>
-      </w:r>
-      <w:r>
-        <w:t>emp_id</w:t>
-      </w:r>
-    </w:p>
-    <w:p>
-      <w:pPr>
-        <w:ind w:left="360"/>
-      </w:pPr>
-      <w:r>
-        <w:t xml:space="preserve">       ) AS next_emp_salary</w:t>
-      </w:r>
-    </w:p>
-    <w:p>
-      <w:pPr>
-        <w:ind w:left="360"/>
-      </w:pPr>
-      <w:r>
-        <w:t>FROM employees;</w:t>
-      </w:r>
-    </w:p>
-    <w:p>
-      <w:pPr>
-        <w:ind w:left="360"/>
-      </w:pPr>
-      <w:r>
-        <w:t>Here, LEAD(salary) returns the salary of the next employee within the same department based on salary order.</w:t>
-      </w:r>
-    </w:p>
-    <w:p>
-      <w:pPr>
-        <w:ind w:left="360"/>
-      </w:pPr>
-      <w:r>
+        <w:rPr>
+          <w:noProof/>
+        </w:rPr>
         <w:drawing>
           <wp:inline distT="0" distB="0" distL="0" distR="0" wp14:anchorId="2AF3758B" wp14:editId="58F12C69">
             <wp:extent cx="3524431" cy="1562180"/>
@@ -6633,7 +7511,6 @@
         <w:ind w:left="360"/>
       </w:pPr>
       <w:r>
-        <w:lastRenderedPageBreak/>
         <w:t>Return the salary from 2 rows ahead; if that row does not exist, return 0.</w:t>
       </w:r>
     </w:p>
@@ -9988,6 +10865,155 @@
     </w:lvl>
   </w:abstractNum>
   <w:abstractNum w:abstractNumId="28" w15:restartNumberingAfterBreak="0">
+    <w:nsid w:val="60F27F47"/>
+    <w:multiLevelType w:val="multilevel"/>
+    <w:tmpl w:val="3252C3C2"/>
+    <w:lvl w:ilvl="0">
+      <w:start w:val="1"/>
+      <w:numFmt w:val="bullet"/>
+      <w:lvlText w:val=""/>
+      <w:lvlJc w:val="left"/>
+      <w:pPr>
+        <w:tabs>
+          <w:tab w:val="num" w:pos="720"/>
+        </w:tabs>
+        <w:ind w:left="720" w:hanging="360"/>
+      </w:pPr>
+      <w:rPr>
+        <w:rFonts w:ascii="Symbol" w:hAnsi="Symbol" w:hint="default"/>
+        <w:sz w:val="20"/>
+      </w:rPr>
+    </w:lvl>
+    <w:lvl w:ilvl="1" w:tentative="1">
+      <w:start w:val="1"/>
+      <w:numFmt w:val="bullet"/>
+      <w:lvlText w:val="o"/>
+      <w:lvlJc w:val="left"/>
+      <w:pPr>
+        <w:tabs>
+          <w:tab w:val="num" w:pos="1440"/>
+        </w:tabs>
+        <w:ind w:left="1440" w:hanging="360"/>
+      </w:pPr>
+      <w:rPr>
+        <w:rFonts w:ascii="Courier New" w:hAnsi="Courier New" w:hint="default"/>
+        <w:sz w:val="20"/>
+      </w:rPr>
+    </w:lvl>
+    <w:lvl w:ilvl="2" w:tentative="1">
+      <w:start w:val="1"/>
+      <w:numFmt w:val="bullet"/>
+      <w:lvlText w:val=""/>
+      <w:lvlJc w:val="left"/>
+      <w:pPr>
+        <w:tabs>
+          <w:tab w:val="num" w:pos="2160"/>
+        </w:tabs>
+        <w:ind w:left="2160" w:hanging="360"/>
+      </w:pPr>
+      <w:rPr>
+        <w:rFonts w:ascii="Wingdings" w:hAnsi="Wingdings" w:hint="default"/>
+        <w:sz w:val="20"/>
+      </w:rPr>
+    </w:lvl>
+    <w:lvl w:ilvl="3" w:tentative="1">
+      <w:start w:val="1"/>
+      <w:numFmt w:val="bullet"/>
+      <w:lvlText w:val=""/>
+      <w:lvlJc w:val="left"/>
+      <w:pPr>
+        <w:tabs>
+          <w:tab w:val="num" w:pos="2880"/>
+        </w:tabs>
+        <w:ind w:left="2880" w:hanging="360"/>
+      </w:pPr>
+      <w:rPr>
+        <w:rFonts w:ascii="Wingdings" w:hAnsi="Wingdings" w:hint="default"/>
+        <w:sz w:val="20"/>
+      </w:rPr>
+    </w:lvl>
+    <w:lvl w:ilvl="4" w:tentative="1">
+      <w:start w:val="1"/>
+      <w:numFmt w:val="bullet"/>
+      <w:lvlText w:val=""/>
+      <w:lvlJc w:val="left"/>
+      <w:pPr>
+        <w:tabs>
+          <w:tab w:val="num" w:pos="3600"/>
+        </w:tabs>
+        <w:ind w:left="3600" w:hanging="360"/>
+      </w:pPr>
+      <w:rPr>
+        <w:rFonts w:ascii="Wingdings" w:hAnsi="Wingdings" w:hint="default"/>
+        <w:sz w:val="20"/>
+      </w:rPr>
+    </w:lvl>
+    <w:lvl w:ilvl="5" w:tentative="1">
+      <w:start w:val="1"/>
+      <w:numFmt w:val="bullet"/>
+      <w:lvlText w:val=""/>
+      <w:lvlJc w:val="left"/>
+      <w:pPr>
+        <w:tabs>
+          <w:tab w:val="num" w:pos="4320"/>
+        </w:tabs>
+        <w:ind w:left="4320" w:hanging="360"/>
+      </w:pPr>
+      <w:rPr>
+        <w:rFonts w:ascii="Wingdings" w:hAnsi="Wingdings" w:hint="default"/>
+        <w:sz w:val="20"/>
+      </w:rPr>
+    </w:lvl>
+    <w:lvl w:ilvl="6" w:tentative="1">
+      <w:start w:val="1"/>
+      <w:numFmt w:val="bullet"/>
+      <w:lvlText w:val=""/>
+      <w:lvlJc w:val="left"/>
+      <w:pPr>
+        <w:tabs>
+          <w:tab w:val="num" w:pos="5040"/>
+        </w:tabs>
+        <w:ind w:left="5040" w:hanging="360"/>
+      </w:pPr>
+      <w:rPr>
+        <w:rFonts w:ascii="Wingdings" w:hAnsi="Wingdings" w:hint="default"/>
+        <w:sz w:val="20"/>
+      </w:rPr>
+    </w:lvl>
+    <w:lvl w:ilvl="7" w:tentative="1">
+      <w:start w:val="1"/>
+      <w:numFmt w:val="bullet"/>
+      <w:lvlText w:val=""/>
+      <w:lvlJc w:val="left"/>
+      <w:pPr>
+        <w:tabs>
+          <w:tab w:val="num" w:pos="5760"/>
+        </w:tabs>
+        <w:ind w:left="5760" w:hanging="360"/>
+      </w:pPr>
+      <w:rPr>
+        <w:rFonts w:ascii="Wingdings" w:hAnsi="Wingdings" w:hint="default"/>
+        <w:sz w:val="20"/>
+      </w:rPr>
+    </w:lvl>
+    <w:lvl w:ilvl="8" w:tentative="1">
+      <w:start w:val="1"/>
+      <w:numFmt w:val="bullet"/>
+      <w:lvlText w:val=""/>
+      <w:lvlJc w:val="left"/>
+      <w:pPr>
+        <w:tabs>
+          <w:tab w:val="num" w:pos="6480"/>
+        </w:tabs>
+        <w:ind w:left="6480" w:hanging="360"/>
+      </w:pPr>
+      <w:rPr>
+        <w:rFonts w:ascii="Wingdings" w:hAnsi="Wingdings" w:hint="default"/>
+        <w:sz w:val="20"/>
+      </w:rPr>
+    </w:lvl>
+  </w:abstractNum>
+  <w:abstractNum w:abstractNumId="29" w15:restartNumberingAfterBreak="0">
     <w:nsid w:val="612357C6"/>
     <w:multiLevelType w:val="multilevel"/>
     <w:tmpl w:val="032AD5E0"/>
@@ -10100,7 +11126,7 @@
       </w:pPr>
     </w:lvl>
   </w:abstractNum>
-  <w:abstractNum w:abstractNumId="29" w15:restartNumberingAfterBreak="0">
+  <w:abstractNum w:abstractNumId="30" w15:restartNumberingAfterBreak="0">
     <w:nsid w:val="63FD31D0"/>
     <w:multiLevelType w:val="multilevel"/>
     <w:tmpl w:val="919A58BC"/>
@@ -10213,7 +11239,7 @@
       </w:pPr>
     </w:lvl>
   </w:abstractNum>
-  <w:abstractNum w:abstractNumId="30" w15:restartNumberingAfterBreak="0">
+  <w:abstractNum w:abstractNumId="31" w15:restartNumberingAfterBreak="0">
     <w:nsid w:val="65314ABA"/>
     <w:multiLevelType w:val="multilevel"/>
     <w:tmpl w:val="08C83AAC"/>
@@ -10362,7 +11388,7 @@
       </w:rPr>
     </w:lvl>
   </w:abstractNum>
-  <w:abstractNum w:abstractNumId="31" w15:restartNumberingAfterBreak="0">
+  <w:abstractNum w:abstractNumId="32" w15:restartNumberingAfterBreak="0">
     <w:nsid w:val="7068233E"/>
     <w:multiLevelType w:val="multilevel"/>
     <w:tmpl w:val="76724DE8"/>
@@ -10475,7 +11501,7 @@
       </w:pPr>
     </w:lvl>
   </w:abstractNum>
-  <w:abstractNum w:abstractNumId="32" w15:restartNumberingAfterBreak="0">
+  <w:abstractNum w:abstractNumId="33" w15:restartNumberingAfterBreak="0">
     <w:nsid w:val="71983665"/>
     <w:multiLevelType w:val="multilevel"/>
     <w:tmpl w:val="FF6457B2"/>
@@ -10588,7 +11614,7 @@
       </w:pPr>
     </w:lvl>
   </w:abstractNum>
-  <w:abstractNum w:abstractNumId="33" w15:restartNumberingAfterBreak="0">
+  <w:abstractNum w:abstractNumId="34" w15:restartNumberingAfterBreak="0">
     <w:nsid w:val="7F110567"/>
     <w:multiLevelType w:val="multilevel"/>
     <w:tmpl w:val="CD561912"/>
@@ -10762,7 +11788,7 @@
     <w:abstractNumId w:val="0"/>
   </w:num>
   <w:num w:numId="9" w16cid:durableId="1776710485">
-    <w:abstractNumId w:val="32"/>
+    <w:abstractNumId w:val="33"/>
   </w:num>
   <w:num w:numId="10" w16cid:durableId="258492482">
     <w:abstractNumId w:val="25"/>
@@ -10810,7 +11836,7 @@
     <w:abstractNumId w:val="13"/>
   </w:num>
   <w:num w:numId="25" w16cid:durableId="239876891">
-    <w:abstractNumId w:val="33"/>
+    <w:abstractNumId w:val="34"/>
   </w:num>
   <w:num w:numId="26" w16cid:durableId="1765614263">
     <w:abstractNumId w:val="14"/>
@@ -10819,25 +11845,28 @@
     <w:abstractNumId w:val="1"/>
   </w:num>
   <w:num w:numId="28" w16cid:durableId="1410231709">
-    <w:abstractNumId w:val="29"/>
+    <w:abstractNumId w:val="30"/>
   </w:num>
   <w:num w:numId="29" w16cid:durableId="971709043">
     <w:abstractNumId w:val="7"/>
   </w:num>
   <w:num w:numId="30" w16cid:durableId="651065738">
-    <w:abstractNumId w:val="30"/>
+    <w:abstractNumId w:val="31"/>
   </w:num>
   <w:num w:numId="31" w16cid:durableId="130098764">
     <w:abstractNumId w:val="3"/>
   </w:num>
   <w:num w:numId="32" w16cid:durableId="1418601543">
-    <w:abstractNumId w:val="28"/>
+    <w:abstractNumId w:val="29"/>
   </w:num>
   <w:num w:numId="33" w16cid:durableId="945427670">
-    <w:abstractNumId w:val="31"/>
+    <w:abstractNumId w:val="32"/>
   </w:num>
   <w:num w:numId="34" w16cid:durableId="1780179236">
     <w:abstractNumId w:val="24"/>
+  </w:num>
+  <w:num w:numId="35" w16cid:durableId="803427576">
+    <w:abstractNumId w:val="28"/>
   </w:num>
 </w:numbering>
 </file>
@@ -11242,7 +12271,7 @@
   <w:style w:type="paragraph" w:default="1" w:styleId="Normal">
     <w:name w:val="Normal"/>
     <w:qFormat/>
-    <w:rsid w:val="00C921E0"/>
+    <w:rsid w:val="00A1495A"/>
   </w:style>
   <w:style w:type="paragraph" w:styleId="Heading1">
     <w:name w:val="heading 1"/>

</xml_diff>

<commit_message>
revision of joins and staticstics
</commit_message>
<xml_diff>
--- a/sql/SQL INTERVIEW QUESTIONS.docx
+++ b/sql/SQL INTERVIEW QUESTIONS.docx
@@ -5166,7 +5166,7 @@
     <w:p>
       <w:r>
         <w:pict w14:anchorId="7C904611">
-          <v:rect id="_x0000_i1147" style="width:0;height:1.5pt" o:hralign="center" o:hrstd="t" o:hr="t" fillcolor="#a0a0a0" stroked="f"/>
+          <v:rect id="_x0000_i1075" style="width:0;height:1.5pt" o:hralign="center" o:hrstd="t" o:hr="t" fillcolor="#a0a0a0" stroked="f"/>
         </w:pict>
       </w:r>
     </w:p>
@@ -5448,7 +5448,7 @@
     <w:p>
       <w:r>
         <w:pict w14:anchorId="45DCFB21">
-          <v:rect id="_x0000_i1148" style="width:0;height:1.5pt" o:hralign="center" o:hrstd="t" o:hr="t" fillcolor="#a0a0a0" stroked="f"/>
+          <v:rect id="_x0000_i1076" style="width:0;height:1.5pt" o:hralign="center" o:hrstd="t" o:hr="t" fillcolor="#a0a0a0" stroked="f"/>
         </w:pict>
       </w:r>
     </w:p>
@@ -5546,7 +5546,7 @@
     <w:p>
       <w:r>
         <w:pict w14:anchorId="499AEBB1">
-          <v:rect id="_x0000_i1149" style="width:0;height:1.5pt" o:hralign="center" o:hrstd="t" o:hr="t" fillcolor="#a0a0a0" stroked="f"/>
+          <v:rect id="_x0000_i1077" style="width:0;height:1.5pt" o:hralign="center" o:hrstd="t" o:hr="t" fillcolor="#a0a0a0" stroked="f"/>
         </w:pict>
       </w:r>
     </w:p>
@@ -5648,7 +5648,7 @@
     <w:p>
       <w:r>
         <w:pict w14:anchorId="5750C2CF">
-          <v:rect id="_x0000_i1150" style="width:0;height:1.5pt" o:hralign="center" o:hrstd="t" o:hr="t" fillcolor="#a0a0a0" stroked="f"/>
+          <v:rect id="_x0000_i1078" style="width:0;height:1.5pt" o:hralign="center" o:hrstd="t" o:hr="t" fillcolor="#a0a0a0" stroked="f"/>
         </w:pict>
       </w:r>
     </w:p>
@@ -5848,223 +5848,6 @@
         <w:t>AUTO_INCREMENT  Generate ID automatically</w:t>
       </w:r>
     </w:p>
-    <w:p/>
-    <w:p>
-      <w:pPr>
-        <w:rPr>
-          <w:b/>
-          <w:bCs/>
-        </w:rPr>
-      </w:pPr>
-    </w:p>
-    <w:p>
-      <w:pPr>
-        <w:rPr>
-          <w:b/>
-          <w:bCs/>
-        </w:rPr>
-      </w:pPr>
-    </w:p>
-    <w:p>
-      <w:pPr>
-        <w:rPr>
-          <w:b/>
-          <w:bCs/>
-        </w:rPr>
-      </w:pPr>
-    </w:p>
-    <w:p>
-      <w:pPr>
-        <w:rPr>
-          <w:b/>
-          <w:bCs/>
-        </w:rPr>
-      </w:pPr>
-    </w:p>
-    <w:p>
-      <w:pPr>
-        <w:rPr>
-          <w:b/>
-          <w:bCs/>
-        </w:rPr>
-      </w:pPr>
-    </w:p>
-    <w:p>
-      <w:pPr>
-        <w:rPr>
-          <w:b/>
-          <w:bCs/>
-        </w:rPr>
-      </w:pPr>
-    </w:p>
-    <w:p>
-      <w:pPr>
-        <w:rPr>
-          <w:b/>
-          <w:bCs/>
-        </w:rPr>
-      </w:pPr>
-    </w:p>
-    <w:p>
-      <w:pPr>
-        <w:rPr>
-          <w:b/>
-          <w:bCs/>
-        </w:rPr>
-      </w:pPr>
-    </w:p>
-    <w:p>
-      <w:pPr>
-        <w:rPr>
-          <w:b/>
-          <w:bCs/>
-        </w:rPr>
-      </w:pPr>
-    </w:p>
-    <w:p>
-      <w:pPr>
-        <w:rPr>
-          <w:b/>
-          <w:bCs/>
-        </w:rPr>
-      </w:pPr>
-    </w:p>
-    <w:p>
-      <w:pPr>
-        <w:rPr>
-          <w:b/>
-          <w:bCs/>
-        </w:rPr>
-      </w:pPr>
-    </w:p>
-    <w:p>
-      <w:pPr>
-        <w:rPr>
-          <w:b/>
-          <w:bCs/>
-        </w:rPr>
-      </w:pPr>
-    </w:p>
-    <w:p>
-      <w:pPr>
-        <w:rPr>
-          <w:b/>
-          <w:bCs/>
-        </w:rPr>
-      </w:pPr>
-    </w:p>
-    <w:p>
-      <w:pPr>
-        <w:rPr>
-          <w:b/>
-          <w:bCs/>
-        </w:rPr>
-      </w:pPr>
-    </w:p>
-    <w:p>
-      <w:pPr>
-        <w:rPr>
-          <w:b/>
-          <w:bCs/>
-        </w:rPr>
-      </w:pPr>
-    </w:p>
-    <w:p>
-      <w:pPr>
-        <w:rPr>
-          <w:b/>
-          <w:bCs/>
-        </w:rPr>
-      </w:pPr>
-    </w:p>
-    <w:p>
-      <w:pPr>
-        <w:rPr>
-          <w:b/>
-          <w:bCs/>
-        </w:rPr>
-      </w:pPr>
-    </w:p>
-    <w:p>
-      <w:pPr>
-        <w:rPr>
-          <w:b/>
-          <w:bCs/>
-        </w:rPr>
-      </w:pPr>
-    </w:p>
-    <w:p>
-      <w:pPr>
-        <w:rPr>
-          <w:b/>
-          <w:bCs/>
-        </w:rPr>
-      </w:pPr>
-    </w:p>
-    <w:p>
-      <w:pPr>
-        <w:rPr>
-          <w:b/>
-          <w:bCs/>
-        </w:rPr>
-      </w:pPr>
-    </w:p>
-    <w:p>
-      <w:pPr>
-        <w:rPr>
-          <w:b/>
-          <w:bCs/>
-        </w:rPr>
-      </w:pPr>
-    </w:p>
-    <w:p>
-      <w:pPr>
-        <w:rPr>
-          <w:b/>
-          <w:bCs/>
-        </w:rPr>
-      </w:pPr>
-    </w:p>
-    <w:p>
-      <w:pPr>
-        <w:rPr>
-          <w:b/>
-          <w:bCs/>
-        </w:rPr>
-      </w:pPr>
-    </w:p>
-    <w:p>
-      <w:pPr>
-        <w:rPr>
-          <w:b/>
-          <w:bCs/>
-        </w:rPr>
-      </w:pPr>
-    </w:p>
-    <w:p>
-      <w:pPr>
-        <w:rPr>
-          <w:b/>
-          <w:bCs/>
-        </w:rPr>
-      </w:pPr>
-    </w:p>
-    <w:p>
-      <w:pPr>
-        <w:rPr>
-          <w:b/>
-          <w:bCs/>
-        </w:rPr>
-      </w:pPr>
-    </w:p>
-    <w:p>
-      <w:pPr>
-        <w:rPr>
-          <w:b/>
-          <w:bCs/>
-        </w:rPr>
-      </w:pPr>
-    </w:p>
     <w:p>
       <w:pPr>
         <w:jc w:val="center"/>
@@ -6083,6 +5866,1497 @@
           <w:szCs w:val="28"/>
         </w:rPr>
         <w:lastRenderedPageBreak/>
+        <w:t>Joins</w:t>
+      </w:r>
+    </w:p>
+    <w:p>
+      <w:pPr>
+        <w:jc w:val="center"/>
+        <w:rPr>
+          <w:b/>
+          <w:bCs/>
+          <w:sz w:val="28"/>
+          <w:szCs w:val="28"/>
+        </w:rPr>
+      </w:pPr>
+    </w:p>
+    <w:p>
+      <w:pPr>
+        <w:rPr>
+          <w:b/>
+          <w:bCs/>
+        </w:rPr>
+      </w:pPr>
+      <w:r>
+        <w:rPr>
+          <w:b/>
+          <w:bCs/>
+        </w:rPr>
+        <w:t>20. What is a JOIN?</w:t>
+      </w:r>
+    </w:p>
+    <w:p>
+      <w:r>
+        <w:t>A JOIN is used to combine rows from two or more tables based on a related column between them.</w:t>
+      </w:r>
+    </w:p>
+    <w:p>
+      <w:r>
+        <w:t>Example:</w:t>
+      </w:r>
+    </w:p>
+    <w:p>
+      <w:r>
+        <w:t>SELECT e.emp_name, d.dept_name</w:t>
+      </w:r>
+    </w:p>
+    <w:p>
+      <w:r>
+        <w:t>FROM employees e</w:t>
+      </w:r>
+    </w:p>
+    <w:p>
+      <w:r>
+        <w:t>JOIN departments d</w:t>
+      </w:r>
+    </w:p>
+    <w:p>
+      <w:r>
+        <w:t>ON e.dept_id = d.dept_id;</w:t>
+      </w:r>
+    </w:p>
+    <w:p>
+      <w:pPr>
+        <w:rPr>
+          <w:b/>
+          <w:bCs/>
+        </w:rPr>
+      </w:pPr>
+      <w:r>
+        <w:rPr>
+          <w:b/>
+          <w:bCs/>
+        </w:rPr>
+        <w:t>Short interview answer</w:t>
+      </w:r>
+    </w:p>
+    <w:p>
+      <w:r>
+        <w:t>A JOIN is used to combine data from multiple tables based on a common or related column.</w:t>
+      </w:r>
+    </w:p>
+    <w:p>
+      <w:r>
+        <w:pict w14:anchorId="031E6A64">
+          <v:rect id="_x0000_i1133" style="width:0;height:1.5pt" o:hralign="center" o:hrstd="t" o:hr="t" fillcolor="#a0a0a0" stroked="f"/>
+        </w:pict>
+      </w:r>
+    </w:p>
+    <w:p>
+      <w:pPr>
+        <w:rPr>
+          <w:b/>
+          <w:bCs/>
+        </w:rPr>
+      </w:pPr>
+      <w:r>
+        <w:rPr>
+          <w:b/>
+          <w:bCs/>
+        </w:rPr>
+        <w:t>21. What is an INNER JOIN?</w:t>
+      </w:r>
+    </w:p>
+    <w:p>
+      <w:r>
+        <w:t>INNER JOIN returns only the rows that have matching values in both tables.</w:t>
+      </w:r>
+    </w:p>
+    <w:p>
+      <w:r>
+        <w:t>Example:</w:t>
+      </w:r>
+    </w:p>
+    <w:p>
+      <w:r>
+        <w:t>SELECT e.emp_name, d.dept_name</w:t>
+      </w:r>
+    </w:p>
+    <w:p>
+      <w:r>
+        <w:t>FROM employees e</w:t>
+      </w:r>
+    </w:p>
+    <w:p>
+      <w:r>
+        <w:t>INNER JOIN departments d</w:t>
+      </w:r>
+    </w:p>
+    <w:p>
+      <w:r>
+        <w:t>ON e.dept_id = d.dept_id;</w:t>
+      </w:r>
+    </w:p>
+    <w:p>
+      <w:r>
+        <w:t>If an employee has no matching department, that employee will not appear.</w:t>
+      </w:r>
+    </w:p>
+    <w:p>
+      <w:pPr>
+        <w:rPr>
+          <w:b/>
+          <w:bCs/>
+        </w:rPr>
+      </w:pPr>
+      <w:r>
+        <w:rPr>
+          <w:b/>
+          <w:bCs/>
+        </w:rPr>
+        <w:t>Short interview answer</w:t>
+      </w:r>
+    </w:p>
+    <w:p>
+      <w:r>
+        <w:t>INNER JOIN returns only the matching records from both tables.</w:t>
+      </w:r>
+    </w:p>
+    <w:p>
+      <w:r>
+        <w:pict w14:anchorId="40E42897">
+          <v:rect id="_x0000_i1134" style="width:0;height:1.5pt" o:hralign="center" o:hrstd="t" o:hr="t" fillcolor="#a0a0a0" stroked="f"/>
+        </w:pict>
+      </w:r>
+    </w:p>
+    <w:p>
+      <w:pPr>
+        <w:rPr>
+          <w:b/>
+          <w:bCs/>
+        </w:rPr>
+      </w:pPr>
+      <w:r>
+        <w:rPr>
+          <w:b/>
+          <w:bCs/>
+        </w:rPr>
+        <w:t>22. What is a LEFT JOIN?</w:t>
+      </w:r>
+    </w:p>
+    <w:p>
+      <w:r>
+        <w:t>LEFT JOIN returns all rows from the left table and the matching rows from the right table.</w:t>
+      </w:r>
+    </w:p>
+    <w:p>
+      <w:r>
+        <w:t>If there is no match in the right table, the right-side columns return NULL.</w:t>
+      </w:r>
+    </w:p>
+    <w:p>
+      <w:r>
+        <w:t>Example:</w:t>
+      </w:r>
+    </w:p>
+    <w:p>
+      <w:r>
+        <w:lastRenderedPageBreak/>
+        <w:t>SELECT e.emp_name, d.dept_name</w:t>
+      </w:r>
+    </w:p>
+    <w:p>
+      <w:r>
+        <w:t>FROM employees e</w:t>
+      </w:r>
+    </w:p>
+    <w:p>
+      <w:r>
+        <w:t>LEFT JOIN departments d</w:t>
+      </w:r>
+    </w:p>
+    <w:p>
+      <w:r>
+        <w:t>ON e.dept_id = d.dept_id;</w:t>
+      </w:r>
+    </w:p>
+    <w:p>
+      <w:pPr>
+        <w:rPr>
+          <w:b/>
+          <w:bCs/>
+        </w:rPr>
+      </w:pPr>
+      <w:r>
+        <w:rPr>
+          <w:b/>
+          <w:bCs/>
+        </w:rPr>
+        <w:t>Short interview answer</w:t>
+      </w:r>
+    </w:p>
+    <w:p>
+      <w:r>
+        <w:t>LEFT JOIN returns all records from the left table and matching records from the right table; non-matching right-side values are returned as NULL.</w:t>
+      </w:r>
+    </w:p>
+    <w:p>
+      <w:r>
+        <w:pict w14:anchorId="0BF5ED6C">
+          <v:rect id="_x0000_i1135" style="width:0;height:1.5pt" o:hralign="center" o:hrstd="t" o:hr="t" fillcolor="#a0a0a0" stroked="f"/>
+        </w:pict>
+      </w:r>
+    </w:p>
+    <w:p>
+      <w:pPr>
+        <w:rPr>
+          <w:b/>
+          <w:bCs/>
+        </w:rPr>
+      </w:pPr>
+      <w:r>
+        <w:rPr>
+          <w:b/>
+          <w:bCs/>
+        </w:rPr>
+        <w:t>23. What is a RIGHT JOIN?</w:t>
+      </w:r>
+    </w:p>
+    <w:p>
+      <w:r>
+        <w:t>RIGHT JOIN returns all rows from the right table and matching rows from the left table.</w:t>
+      </w:r>
+    </w:p>
+    <w:p>
+      <w:r>
+        <w:t>If there is no matching row in the left table, the left-side columns return NULL.</w:t>
+      </w:r>
+    </w:p>
+    <w:p>
+      <w:r>
+        <w:t>Example:</w:t>
+      </w:r>
+    </w:p>
+    <w:p>
+      <w:r>
+        <w:t>SELECT e.emp_name, d.dept_name</w:t>
+      </w:r>
+    </w:p>
+    <w:p>
+      <w:r>
+        <w:t>FROM employees e</w:t>
+      </w:r>
+    </w:p>
+    <w:p>
+      <w:r>
+        <w:t>RIGHT JOIN departments d</w:t>
+      </w:r>
+    </w:p>
+    <w:p>
+      <w:r>
+        <w:t>ON e.dept_id = d.dept_id;</w:t>
+      </w:r>
+    </w:p>
+    <w:p>
+      <w:pPr>
+        <w:rPr>
+          <w:b/>
+          <w:bCs/>
+        </w:rPr>
+      </w:pPr>
+      <w:r>
+        <w:rPr>
+          <w:b/>
+          <w:bCs/>
+        </w:rPr>
+        <w:t>Short interview answer</w:t>
+      </w:r>
+    </w:p>
+    <w:p>
+      <w:r>
+        <w:t>RIGHT JOIN returns all rows from the right table and matching rows from the left table; non-matching left-side values appear as NULL.</w:t>
+      </w:r>
+    </w:p>
+    <w:p>
+      <w:r>
+        <w:pict w14:anchorId="74A1F411">
+          <v:rect id="_x0000_i1136" style="width:0;height:1.5pt" o:hralign="center" o:hrstd="t" o:hr="t" fillcolor="#a0a0a0" stroked="f"/>
+        </w:pict>
+      </w:r>
+    </w:p>
+    <w:p>
+      <w:pPr>
+        <w:rPr>
+          <w:b/>
+          <w:bCs/>
+        </w:rPr>
+      </w:pPr>
+      <w:r>
+        <w:rPr>
+          <w:b/>
+          <w:bCs/>
+        </w:rPr>
+        <w:t>24. What is a FULL OUTER JOIN?</w:t>
+      </w:r>
+    </w:p>
+    <w:p>
+      <w:r>
+        <w:t>FULL OUTER JOIN returns:</w:t>
+      </w:r>
+    </w:p>
+    <w:p>
+      <w:pPr>
+        <w:numPr>
+          <w:ilvl w:val="0"/>
+          <w:numId w:val="36"/>
+        </w:numPr>
+      </w:pPr>
+      <w:r>
+        <w:t>all matching rows</w:t>
+      </w:r>
+    </w:p>
+    <w:p>
+      <w:pPr>
+        <w:numPr>
+          <w:ilvl w:val="0"/>
+          <w:numId w:val="36"/>
+        </w:numPr>
+      </w:pPr>
+      <w:r>
+        <w:t>all non-matching rows from the left table</w:t>
+      </w:r>
+    </w:p>
+    <w:p>
+      <w:pPr>
+        <w:numPr>
+          <w:ilvl w:val="0"/>
+          <w:numId w:val="36"/>
+        </w:numPr>
+      </w:pPr>
+      <w:r>
+        <w:t>all non-matching rows from the right table</w:t>
+      </w:r>
+    </w:p>
+    <w:p>
+      <w:r>
+        <w:t>Where no match exists, the missing side contains NULL.</w:t>
+      </w:r>
+    </w:p>
+    <w:p>
+      <w:r>
+        <w:t>Example:</w:t>
+      </w:r>
+    </w:p>
+    <w:p>
+      <w:r>
+        <w:t>SELECT e.emp_name, d.dept_name</w:t>
+      </w:r>
+    </w:p>
+    <w:p>
+      <w:r>
+        <w:t>FROM employees e</w:t>
+      </w:r>
+    </w:p>
+    <w:p>
+      <w:r>
+        <w:lastRenderedPageBreak/>
+        <w:t>FULL OUTER JOIN departments d</w:t>
+      </w:r>
+    </w:p>
+    <w:p>
+      <w:r>
+        <w:t>ON e.dept_id = d.dept_id;</w:t>
+      </w:r>
+    </w:p>
+    <w:p>
+      <w:pPr>
+        <w:rPr>
+          <w:b/>
+          <w:bCs/>
+        </w:rPr>
+      </w:pPr>
+      <w:r>
+        <w:rPr>
+          <w:b/>
+          <w:bCs/>
+        </w:rPr>
+        <w:t>Short interview answer</w:t>
+      </w:r>
+    </w:p>
+    <w:p>
+      <w:r>
+        <w:t>FULL OUTER JOIN returns all matched and unmatched rows from both tables.</w:t>
+      </w:r>
+    </w:p>
+    <w:p>
+      <w:r>
+        <w:t>Important note: MySQL does not support FULL OUTER JOIN directly.</w:t>
+      </w:r>
+    </w:p>
+    <w:p>
+      <w:r>
+        <w:pict w14:anchorId="041D13FC">
+          <v:rect id="_x0000_i1137" style="width:0;height:1.5pt" o:hralign="center" o:hrstd="t" o:hr="t" fillcolor="#a0a0a0" stroked="f"/>
+        </w:pict>
+      </w:r>
+    </w:p>
+    <w:p>
+      <w:pPr>
+        <w:rPr>
+          <w:b/>
+          <w:bCs/>
+        </w:rPr>
+      </w:pPr>
+      <w:r>
+        <w:rPr>
+          <w:b/>
+          <w:bCs/>
+        </w:rPr>
+        <w:t>25. What is a CROSS JOIN?</w:t>
+      </w:r>
+    </w:p>
+    <w:p>
+      <w:r>
+        <w:t>CROSS JOIN returns the Cartesian product of two tables.</w:t>
+      </w:r>
+    </w:p>
+    <w:p>
+      <w:r>
+        <w:t>That means every row from the first table is combined with every row from the second table.</w:t>
+      </w:r>
+    </w:p>
+    <w:p>
+      <w:r>
+        <w:t>If:</w:t>
+      </w:r>
+    </w:p>
+    <w:p>
+      <w:r>
+        <w:t>Table A → 3 rows</w:t>
+      </w:r>
+    </w:p>
+    <w:p>
+      <w:r>
+        <w:t>Table B → 4 rows</w:t>
+      </w:r>
+    </w:p>
+    <w:p>
+      <w:r>
+        <w:t>then:</w:t>
+      </w:r>
+    </w:p>
+    <w:p>
+      <w:r>
+        <w:t>CROSS JOIN → 12 rows</w:t>
+      </w:r>
+    </w:p>
+    <w:p>
+      <w:r>
+        <w:t>Example:</w:t>
+      </w:r>
+    </w:p>
+    <w:p>
+      <w:r>
+        <w:t>SELECT *</w:t>
+      </w:r>
+    </w:p>
+    <w:p>
+      <w:r>
+        <w:t>FROM employees</w:t>
+      </w:r>
+    </w:p>
+    <w:p>
+      <w:r>
+        <w:t>CROSS JOIN departments;</w:t>
+      </w:r>
+    </w:p>
+    <w:p>
+      <w:pPr>
+        <w:rPr>
+          <w:b/>
+          <w:bCs/>
+        </w:rPr>
+      </w:pPr>
+      <w:r>
+        <w:rPr>
+          <w:b/>
+          <w:bCs/>
+        </w:rPr>
+        <w:t>Short interview answer</w:t>
+      </w:r>
+    </w:p>
+    <w:p>
+      <w:r>
+        <w:t>CROSS JOIN returns every possible combination of rows from the two tables.</w:t>
+      </w:r>
+    </w:p>
+    <w:p>
+      <w:r>
+        <w:pict w14:anchorId="6A945BEC">
+          <v:rect id="_x0000_i1138" style="width:0;height:1.5pt" o:hralign="center" o:hrstd="t" o:hr="t" fillcolor="#a0a0a0" stroked="f"/>
+        </w:pict>
+      </w:r>
+    </w:p>
+    <w:p>
+      <w:pPr>
+        <w:rPr>
+          <w:b/>
+          <w:bCs/>
+        </w:rPr>
+      </w:pPr>
+      <w:r>
+        <w:rPr>
+          <w:b/>
+          <w:bCs/>
+        </w:rPr>
+        <w:t>26. What is a SELF JOIN?</w:t>
+      </w:r>
+    </w:p>
+    <w:p>
+      <w:r>
+        <w:t>A SELF JOIN is when a table is joined with itself.</w:t>
+      </w:r>
+    </w:p>
+    <w:p>
+      <w:r>
+        <w:t>It is commonly used for hierarchical relationships, such as employee-manager data.</w:t>
+      </w:r>
+    </w:p>
+    <w:p>
+      <w:r>
+        <w:t>Suppose:</w:t>
+      </w:r>
+    </w:p>
+    <w:p>
+      <w:r>
+        <w:t>emp_id</w:t>
+      </w:r>
+    </w:p>
+    <w:p>
+      <w:r>
+        <w:t>emp_name</w:t>
+      </w:r>
+    </w:p>
+    <w:p>
+      <w:r>
+        <w:lastRenderedPageBreak/>
+        <w:t>manager_id</w:t>
+      </w:r>
+    </w:p>
+    <w:p>
+      <w:r>
+        <w:t>Then:</w:t>
+      </w:r>
+    </w:p>
+    <w:p>
+      <w:r>
+        <w:t>SELECT e.emp_name AS employee,</w:t>
+      </w:r>
+    </w:p>
+    <w:p>
+      <w:r>
+        <w:t xml:space="preserve">       m.emp_name AS manager</w:t>
+      </w:r>
+    </w:p>
+    <w:p>
+      <w:r>
+        <w:t>FROM employees e</w:t>
+      </w:r>
+    </w:p>
+    <w:p>
+      <w:r>
+        <w:t>LEFT JOIN employees m</w:t>
+      </w:r>
+    </w:p>
+    <w:p>
+      <w:r>
+        <w:t>ON e.manager_id = m.emp_id;</w:t>
+      </w:r>
+    </w:p>
+    <w:p>
+      <w:r>
+        <w:t>Here, the same table is used twice with different aliases.</w:t>
+      </w:r>
+    </w:p>
+    <w:p>
+      <w:pPr>
+        <w:rPr>
+          <w:b/>
+          <w:bCs/>
+        </w:rPr>
+      </w:pPr>
+      <w:r>
+        <w:rPr>
+          <w:b/>
+          <w:bCs/>
+        </w:rPr>
+        <w:t>Short interview answer</w:t>
+      </w:r>
+    </w:p>
+    <w:p>
+      <w:r>
+        <w:t>A SELF JOIN joins a table with itself, usually to compare rows within the same table or represent hierarchical relationships such as employee-manager relationships.</w:t>
+      </w:r>
+    </w:p>
+    <w:p>
+      <w:r>
+        <w:pict w14:anchorId="58976179">
+          <v:rect id="_x0000_i1139" style="width:0;height:1.5pt" o:hralign="center" o:hrstd="t" o:hr="t" fillcolor="#a0a0a0" stroked="f"/>
+        </w:pict>
+      </w:r>
+    </w:p>
+    <w:p>
+      <w:pPr>
+        <w:rPr>
+          <w:b/>
+          <w:bCs/>
+        </w:rPr>
+      </w:pPr>
+      <w:r>
+        <w:rPr>
+          <w:b/>
+          <w:bCs/>
+        </w:rPr>
+        <w:t>27. Difference between INNER JOIN and LEFT JOIN</w:t>
+      </w:r>
+    </w:p>
+    <w:tbl>
+      <w:tblPr>
+        <w:tblW w:w="0" w:type="auto"/>
+        <w:tblCellSpacing w:w="15" w:type="dxa"/>
+        <w:tblCellMar>
+          <w:top w:w="15" w:type="dxa"/>
+          <w:left w:w="15" w:type="dxa"/>
+          <w:bottom w:w="15" w:type="dxa"/>
+          <w:right w:w="15" w:type="dxa"/>
+        </w:tblCellMar>
+        <w:tblLook w:val="04A0" w:firstRow="1" w:lastRow="0" w:firstColumn="1" w:lastColumn="0" w:noHBand="0" w:noVBand="1"/>
+      </w:tblPr>
+      <w:tblGrid>
+        <w:gridCol w:w="3145"/>
+        <w:gridCol w:w="4857"/>
+      </w:tblGrid>
+      <w:tr>
+        <w:trPr>
+          <w:tblHeader/>
+          <w:tblCellSpacing w:w="15" w:type="dxa"/>
+        </w:trPr>
+        <w:tc>
+          <w:tcPr>
+            <w:tcW w:w="0" w:type="auto"/>
+            <w:vAlign w:val="center"/>
+            <w:hideMark/>
+          </w:tcPr>
+          <w:p>
+            <w:pPr>
+              <w:rPr>
+                <w:b/>
+                <w:bCs/>
+              </w:rPr>
+            </w:pPr>
+            <w:r>
+              <w:rPr>
+                <w:b/>
+                <w:bCs/>
+              </w:rPr>
+              <w:t>INNER JOIN</w:t>
+            </w:r>
+          </w:p>
+        </w:tc>
+        <w:tc>
+          <w:tcPr>
+            <w:tcW w:w="0" w:type="auto"/>
+            <w:vAlign w:val="center"/>
+            <w:hideMark/>
+          </w:tcPr>
+          <w:p>
+            <w:pPr>
+              <w:rPr>
+                <w:b/>
+                <w:bCs/>
+              </w:rPr>
+            </w:pPr>
+            <w:r>
+              <w:rPr>
+                <w:b/>
+                <w:bCs/>
+              </w:rPr>
+              <w:t>LEFT JOIN</w:t>
+            </w:r>
+          </w:p>
+        </w:tc>
+      </w:tr>
+      <w:tr>
+        <w:trPr>
+          <w:tblCellSpacing w:w="15" w:type="dxa"/>
+        </w:trPr>
+        <w:tc>
+          <w:tcPr>
+            <w:tcW w:w="0" w:type="auto"/>
+            <w:vAlign w:val="center"/>
+            <w:hideMark/>
+          </w:tcPr>
+          <w:p>
+            <w:r>
+              <w:t>Returns only matched rows</w:t>
+            </w:r>
+          </w:p>
+        </w:tc>
+        <w:tc>
+          <w:tcPr>
+            <w:tcW w:w="0" w:type="auto"/>
+            <w:vAlign w:val="center"/>
+            <w:hideMark/>
+          </w:tcPr>
+          <w:p>
+            <w:r>
+              <w:t>Returns all rows from the left table</w:t>
+            </w:r>
+          </w:p>
+        </w:tc>
+      </w:tr>
+      <w:tr>
+        <w:trPr>
+          <w:tblCellSpacing w:w="15" w:type="dxa"/>
+        </w:trPr>
+        <w:tc>
+          <w:tcPr>
+            <w:tcW w:w="0" w:type="auto"/>
+            <w:vAlign w:val="center"/>
+            <w:hideMark/>
+          </w:tcPr>
+          <w:p>
+            <w:r>
+              <w:t>Unmatched rows are excluded</w:t>
+            </w:r>
+          </w:p>
+        </w:tc>
+        <w:tc>
+          <w:tcPr>
+            <w:tcW w:w="0" w:type="auto"/>
+            <w:vAlign w:val="center"/>
+            <w:hideMark/>
+          </w:tcPr>
+          <w:p>
+            <w:r>
+              <w:t>Unmatched left rows remain</w:t>
+            </w:r>
+          </w:p>
+        </w:tc>
+      </w:tr>
+      <w:tr>
+        <w:trPr>
+          <w:tblCellSpacing w:w="15" w:type="dxa"/>
+        </w:trPr>
+        <w:tc>
+          <w:tcPr>
+            <w:tcW w:w="0" w:type="auto"/>
+            <w:vAlign w:val="center"/>
+            <w:hideMark/>
+          </w:tcPr>
+          <w:p>
+            <w:r>
+              <w:t>Requires a match in both tables</w:t>
+            </w:r>
+          </w:p>
+        </w:tc>
+        <w:tc>
+          <w:tcPr>
+            <w:tcW w:w="0" w:type="auto"/>
+            <w:vAlign w:val="center"/>
+            <w:hideMark/>
+          </w:tcPr>
+          <w:p>
+            <w:r>
+              <w:t>Right-side values become NULL if no match exists</w:t>
+            </w:r>
+          </w:p>
+        </w:tc>
+      </w:tr>
+    </w:tbl>
+    <w:p>
+      <w:pPr>
+        <w:rPr>
+          <w:b/>
+          <w:bCs/>
+        </w:rPr>
+      </w:pPr>
+      <w:r>
+        <w:rPr>
+          <w:b/>
+          <w:bCs/>
+        </w:rPr>
+        <w:t>Short interview answer</w:t>
+      </w:r>
+    </w:p>
+    <w:p>
+      <w:r>
+        <w:t>INNER JOIN returns only matching rows from both tables, while LEFT JOIN returns all rows from the left table plus matching rows from the right table.</w:t>
+      </w:r>
+    </w:p>
+    <w:p>
+      <w:r>
+        <w:pict w14:anchorId="428338A5">
+          <v:rect id="_x0000_i1140" style="width:0;height:1.5pt" o:hralign="center" o:hrstd="t" o:hr="t" fillcolor="#a0a0a0" stroked="f"/>
+        </w:pict>
+      </w:r>
+    </w:p>
+    <w:p>
+      <w:pPr>
+        <w:rPr>
+          <w:b/>
+          <w:bCs/>
+        </w:rPr>
+      </w:pPr>
+      <w:r>
+        <w:rPr>
+          <w:b/>
+          <w:bCs/>
+        </w:rPr>
+        <w:t>28. Difference between CROSS JOIN and INNER JOIN</w:t>
+      </w:r>
+    </w:p>
+    <w:tbl>
+      <w:tblPr>
+        <w:tblW w:w="0" w:type="auto"/>
+        <w:tblCellSpacing w:w="15" w:type="dxa"/>
+        <w:tblCellMar>
+          <w:top w:w="15" w:type="dxa"/>
+          <w:left w:w="15" w:type="dxa"/>
+          <w:bottom w:w="15" w:type="dxa"/>
+          <w:right w:w="15" w:type="dxa"/>
+        </w:tblCellMar>
+        <w:tblLook w:val="04A0" w:firstRow="1" w:lastRow="0" w:firstColumn="1" w:lastColumn="0" w:noHBand="0" w:noVBand="1"/>
+      </w:tblPr>
+      <w:tblGrid>
+        <w:gridCol w:w="3981"/>
+        <w:gridCol w:w="2781"/>
+      </w:tblGrid>
+      <w:tr>
+        <w:trPr>
+          <w:tblHeader/>
+          <w:tblCellSpacing w:w="15" w:type="dxa"/>
+        </w:trPr>
+        <w:tc>
+          <w:tcPr>
+            <w:tcW w:w="0" w:type="auto"/>
+            <w:vAlign w:val="center"/>
+            <w:hideMark/>
+          </w:tcPr>
+          <w:p>
+            <w:pPr>
+              <w:rPr>
+                <w:b/>
+                <w:bCs/>
+              </w:rPr>
+            </w:pPr>
+            <w:r>
+              <w:rPr>
+                <w:b/>
+                <w:bCs/>
+              </w:rPr>
+              <w:t>CROSS JOIN</w:t>
+            </w:r>
+          </w:p>
+        </w:tc>
+        <w:tc>
+          <w:tcPr>
+            <w:tcW w:w="0" w:type="auto"/>
+            <w:vAlign w:val="center"/>
+            <w:hideMark/>
+          </w:tcPr>
+          <w:p>
+            <w:pPr>
+              <w:rPr>
+                <w:b/>
+                <w:bCs/>
+              </w:rPr>
+            </w:pPr>
+            <w:r>
+              <w:rPr>
+                <w:b/>
+                <w:bCs/>
+              </w:rPr>
+              <w:t>INNER JOIN</w:t>
+            </w:r>
+          </w:p>
+        </w:tc>
+      </w:tr>
+      <w:tr>
+        <w:trPr>
+          <w:tblCellSpacing w:w="15" w:type="dxa"/>
+        </w:trPr>
+        <w:tc>
+          <w:tcPr>
+            <w:tcW w:w="0" w:type="auto"/>
+            <w:vAlign w:val="center"/>
+            <w:hideMark/>
+          </w:tcPr>
+          <w:p>
+            <w:r>
+              <w:t>Returns every possible row combination</w:t>
+            </w:r>
+          </w:p>
+        </w:tc>
+        <w:tc>
+          <w:tcPr>
+            <w:tcW w:w="0" w:type="auto"/>
+            <w:vAlign w:val="center"/>
+            <w:hideMark/>
+          </w:tcPr>
+          <w:p>
+            <w:r>
+              <w:t>Returns only matching rows</w:t>
+            </w:r>
+          </w:p>
+        </w:tc>
+      </w:tr>
+      <w:tr>
+        <w:trPr>
+          <w:tblCellSpacing w:w="15" w:type="dxa"/>
+        </w:trPr>
+        <w:tc>
+          <w:tcPr>
+            <w:tcW w:w="0" w:type="auto"/>
+            <w:vAlign w:val="center"/>
+            <w:hideMark/>
+          </w:tcPr>
+          <w:p>
+            <w:r>
+              <w:t>Usually has no join condition</w:t>
+            </w:r>
+          </w:p>
+        </w:tc>
+        <w:tc>
+          <w:tcPr>
+            <w:tcW w:w="0" w:type="auto"/>
+            <w:vAlign w:val="center"/>
+            <w:hideMark/>
+          </w:tcPr>
+          <w:p>
+            <w:r>
+              <w:t>Uses a join condition</w:t>
+            </w:r>
+          </w:p>
+        </w:tc>
+      </w:tr>
+      <w:tr>
+        <w:trPr>
+          <w:tblCellSpacing w:w="15" w:type="dxa"/>
+        </w:trPr>
+        <w:tc>
+          <w:tcPr>
+            <w:tcW w:w="0" w:type="auto"/>
+            <w:vAlign w:val="center"/>
+            <w:hideMark/>
+          </w:tcPr>
+          <w:p>
+            <w:r>
+              <w:t>Produces Cartesian product</w:t>
+            </w:r>
+          </w:p>
+        </w:tc>
+        <w:tc>
+          <w:tcPr>
+            <w:tcW w:w="0" w:type="auto"/>
+            <w:vAlign w:val="center"/>
+            <w:hideMark/>
+          </w:tcPr>
+          <w:p>
+            <w:r>
+              <w:t>Produces matched data</w:t>
+            </w:r>
+          </w:p>
+        </w:tc>
+      </w:tr>
+      <w:tr>
+        <w:trPr>
+          <w:tblCellSpacing w:w="15" w:type="dxa"/>
+        </w:trPr>
+        <w:tc>
+          <w:tcPr>
+            <w:tcW w:w="0" w:type="auto"/>
+            <w:vAlign w:val="center"/>
+            <w:hideMark/>
+          </w:tcPr>
+          <w:p>
+            <w:r>
+              <w:t>Can create a very large result</w:t>
+            </w:r>
+          </w:p>
+        </w:tc>
+        <w:tc>
+          <w:tcPr>
+            <w:tcW w:w="0" w:type="auto"/>
+            <w:vAlign w:val="center"/>
+            <w:hideMark/>
+          </w:tcPr>
+          <w:p>
+            <w:r>
+              <w:t>Usually returns fewer rows</w:t>
+            </w:r>
+          </w:p>
+        </w:tc>
+      </w:tr>
+    </w:tbl>
+    <w:p>
+      <w:r>
+        <w:lastRenderedPageBreak/>
+        <w:t>Example:</w:t>
+      </w:r>
+    </w:p>
+    <w:p>
+      <w:r>
+        <w:t>A = 5 rows</w:t>
+      </w:r>
+    </w:p>
+    <w:p>
+      <w:r>
+        <w:t>B = 4 rows</w:t>
+      </w:r>
+    </w:p>
+    <w:p/>
+    <w:p>
+      <w:r>
+        <w:t>CROSS JOIN = 20 rows</w:t>
+      </w:r>
+    </w:p>
+    <w:p>
+      <w:r>
+        <w:t>An INNER JOIN could return any number of matching rows depending on the condition.</w:t>
+      </w:r>
+    </w:p>
+    <w:p>
+      <w:pPr>
+        <w:rPr>
+          <w:b/>
+          <w:bCs/>
+        </w:rPr>
+      </w:pPr>
+      <w:r>
+        <w:rPr>
+          <w:b/>
+          <w:bCs/>
+        </w:rPr>
+        <w:t>Short interview answer</w:t>
+      </w:r>
+    </w:p>
+    <w:p>
+      <w:r>
+        <w:t>CROSS JOIN returns the Cartesian product of two tables, while INNER JOIN returns only rows that satisfy the join condition.</w:t>
+      </w:r>
+    </w:p>
+    <w:p>
+      <w:r>
+        <w:pict w14:anchorId="3F20FC0A">
+          <v:rect id="_x0000_i1141" style="width:0;height:1.5pt" o:hralign="center" o:hrstd="t" o:hr="t" fillcolor="#a0a0a0" stroked="f"/>
+        </w:pict>
+      </w:r>
+    </w:p>
+    <w:p>
+      <w:pPr>
+        <w:rPr>
+          <w:b/>
+          <w:bCs/>
+        </w:rPr>
+      </w:pPr>
+      <w:r>
+        <w:rPr>
+          <w:b/>
+          <w:bCs/>
+        </w:rPr>
+        <w:t>29. When would you use a SELF JOIN?</w:t>
+      </w:r>
+    </w:p>
+    <w:p>
+      <w:r>
+        <w:t>A SELF JOIN is used when records within the same table need to be compared or related to one another.</w:t>
+      </w:r>
+    </w:p>
+    <w:p>
+      <w:r>
+        <w:t>Common use cases:</w:t>
+      </w:r>
+    </w:p>
+    <w:p>
+      <w:pPr>
+        <w:numPr>
+          <w:ilvl w:val="0"/>
+          <w:numId w:val="37"/>
+        </w:numPr>
+      </w:pPr>
+      <w:r>
+        <w:t>employee-manager hierarchy</w:t>
+      </w:r>
+    </w:p>
+    <w:p>
+      <w:pPr>
+        <w:numPr>
+          <w:ilvl w:val="0"/>
+          <w:numId w:val="37"/>
+        </w:numPr>
+      </w:pPr>
+      <w:r>
+        <w:t>parent-child relationships</w:t>
+      </w:r>
+    </w:p>
+    <w:p>
+      <w:pPr>
+        <w:numPr>
+          <w:ilvl w:val="0"/>
+          <w:numId w:val="37"/>
+        </w:numPr>
+      </w:pPr>
+      <w:r>
+        <w:t>comparing employees in the same department</w:t>
+      </w:r>
+    </w:p>
+    <w:p>
+      <w:pPr>
+        <w:numPr>
+          <w:ilvl w:val="0"/>
+          <w:numId w:val="37"/>
+        </w:numPr>
+      </w:pPr>
+      <w:r>
+        <w:t>finding related rows within one table</w:t>
+      </w:r>
+    </w:p>
+    <w:p>
+      <w:r>
+        <w:t>Example:</w:t>
+      </w:r>
+    </w:p>
+    <w:p>
+      <w:r>
+        <w:t>SELECT e.emp_name AS employee,</w:t>
+      </w:r>
+    </w:p>
+    <w:p>
+      <w:r>
+        <w:t xml:space="preserve">       m.emp_name AS manager</w:t>
+      </w:r>
+    </w:p>
+    <w:p>
+      <w:r>
+        <w:t>FROM employees e</w:t>
+      </w:r>
+    </w:p>
+    <w:p>
+      <w:r>
+        <w:t>LEFT JOIN employees m</w:t>
+      </w:r>
+    </w:p>
+    <w:p>
+      <w:r>
+        <w:t>ON e.manager_id = m.emp_id;</w:t>
+      </w:r>
+    </w:p>
+    <w:p>
+      <w:pPr>
+        <w:rPr>
+          <w:b/>
+          <w:bCs/>
+        </w:rPr>
+      </w:pPr>
+      <w:r>
+        <w:rPr>
+          <w:b/>
+          <w:bCs/>
+        </w:rPr>
+        <w:t>Short interview answer</w:t>
+      </w:r>
+    </w:p>
+    <w:p>
+      <w:r>
+        <w:t>A SELF JOIN is commonly used when data in one table has a relationship with other rows in the same table, such as employees and their managers.</w:t>
+      </w:r>
+    </w:p>
+    <w:p>
+      <w:r>
+        <w:t>For interview memory, the simplest summary is:</w:t>
+      </w:r>
+    </w:p>
+    <w:p>
+      <w:r>
+        <w:t>INNER → matching only</w:t>
+      </w:r>
+    </w:p>
+    <w:p>
+      <w:r>
+        <w:lastRenderedPageBreak/>
+        <w:t>LEFT  → all left + matching right</w:t>
+      </w:r>
+    </w:p>
+    <w:p>
+      <w:r>
+        <w:t>RIGHT → all right + matching left</w:t>
+      </w:r>
+    </w:p>
+    <w:p>
+      <w:r>
+        <w:t>FULL  → everything from both</w:t>
+      </w:r>
+    </w:p>
+    <w:p>
+      <w:r>
+        <w:t>CROSS → every combination</w:t>
+      </w:r>
+    </w:p>
+    <w:p>
+      <w:r>
+        <w:t>SELF  → table joined with itself</w:t>
+      </w:r>
+    </w:p>
+    <w:p>
+      <w:r>
+        <w:t xml:space="preserve">These cover your </w:t>
+      </w:r>
+      <w:r>
+        <w:rPr>
+          <w:b/>
+          <w:bCs/>
+        </w:rPr>
+        <w:t>Questions 20–29: Joins</w:t>
+      </w:r>
+      <w:r>
+        <w:t>.</w:t>
+      </w:r>
+    </w:p>
+    <w:p/>
+    <w:p>
+      <w:pPr>
+        <w:rPr>
+          <w:b/>
+          <w:bCs/>
+        </w:rPr>
+      </w:pPr>
+    </w:p>
+    <w:p>
+      <w:pPr>
+        <w:rPr>
+          <w:b/>
+          <w:bCs/>
+        </w:rPr>
+      </w:pPr>
+    </w:p>
+    <w:p>
+      <w:pPr>
+        <w:rPr>
+          <w:b/>
+          <w:bCs/>
+        </w:rPr>
+      </w:pPr>
+    </w:p>
+    <w:p>
+      <w:pPr>
+        <w:rPr>
+          <w:b/>
+          <w:bCs/>
+        </w:rPr>
+      </w:pPr>
+    </w:p>
+    <w:p>
+      <w:pPr>
+        <w:rPr>
+          <w:b/>
+          <w:bCs/>
+        </w:rPr>
+      </w:pPr>
+    </w:p>
+    <w:p>
+      <w:pPr>
+        <w:rPr>
+          <w:b/>
+          <w:bCs/>
+        </w:rPr>
+      </w:pPr>
+    </w:p>
+    <w:p>
+      <w:pPr>
+        <w:rPr>
+          <w:b/>
+          <w:bCs/>
+        </w:rPr>
+      </w:pPr>
+    </w:p>
+    <w:p>
+      <w:pPr>
+        <w:rPr>
+          <w:b/>
+          <w:bCs/>
+        </w:rPr>
+      </w:pPr>
+    </w:p>
+    <w:p>
+      <w:pPr>
+        <w:rPr>
+          <w:b/>
+          <w:bCs/>
+        </w:rPr>
+      </w:pPr>
+    </w:p>
+    <w:p>
+      <w:pPr>
+        <w:rPr>
+          <w:b/>
+          <w:bCs/>
+        </w:rPr>
+      </w:pPr>
+    </w:p>
+    <w:p>
+      <w:pPr>
+        <w:rPr>
+          <w:b/>
+          <w:bCs/>
+        </w:rPr>
+      </w:pPr>
+    </w:p>
+    <w:p>
+      <w:pPr>
+        <w:rPr>
+          <w:b/>
+          <w:bCs/>
+        </w:rPr>
+      </w:pPr>
+    </w:p>
+    <w:p>
+      <w:pPr>
+        <w:rPr>
+          <w:b/>
+          <w:bCs/>
+        </w:rPr>
+      </w:pPr>
+    </w:p>
+    <w:p>
+      <w:pPr>
+        <w:rPr>
+          <w:b/>
+          <w:bCs/>
+        </w:rPr>
+      </w:pPr>
+    </w:p>
+    <w:p>
+      <w:pPr>
+        <w:rPr>
+          <w:b/>
+          <w:bCs/>
+        </w:rPr>
+      </w:pPr>
+    </w:p>
+    <w:p>
+      <w:pPr>
+        <w:rPr>
+          <w:b/>
+          <w:bCs/>
+        </w:rPr>
+      </w:pPr>
+    </w:p>
+    <w:p>
+      <w:pPr>
+        <w:rPr>
+          <w:b/>
+          <w:bCs/>
+        </w:rPr>
+      </w:pPr>
+    </w:p>
+    <w:p>
+      <w:pPr>
+        <w:rPr>
+          <w:b/>
+          <w:bCs/>
+        </w:rPr>
+      </w:pPr>
+    </w:p>
+    <w:p>
+      <w:pPr>
+        <w:rPr>
+          <w:b/>
+          <w:bCs/>
+        </w:rPr>
+      </w:pPr>
+    </w:p>
+    <w:p>
+      <w:pPr>
+        <w:rPr>
+          <w:b/>
+          <w:bCs/>
+        </w:rPr>
+      </w:pPr>
+    </w:p>
+    <w:p>
+      <w:pPr>
+        <w:rPr>
+          <w:b/>
+          <w:bCs/>
+        </w:rPr>
+      </w:pPr>
+    </w:p>
+    <w:p>
+      <w:pPr>
+        <w:rPr>
+          <w:b/>
+          <w:bCs/>
+        </w:rPr>
+      </w:pPr>
+    </w:p>
+    <w:p>
+      <w:pPr>
+        <w:rPr>
+          <w:b/>
+          <w:bCs/>
+        </w:rPr>
+      </w:pPr>
+    </w:p>
+    <w:p>
+      <w:pPr>
+        <w:rPr>
+          <w:b/>
+          <w:bCs/>
+        </w:rPr>
+      </w:pPr>
+    </w:p>
+    <w:p>
+      <w:pPr>
+        <w:rPr>
+          <w:b/>
+          <w:bCs/>
+        </w:rPr>
+      </w:pPr>
+    </w:p>
+    <w:p>
+      <w:pPr>
+        <w:rPr>
+          <w:b/>
+          <w:bCs/>
+        </w:rPr>
+      </w:pPr>
+    </w:p>
+    <w:p>
+      <w:pPr>
+        <w:rPr>
+          <w:b/>
+          <w:bCs/>
+        </w:rPr>
+      </w:pPr>
+    </w:p>
+    <w:p>
+      <w:pPr>
+        <w:jc w:val="center"/>
+        <w:rPr>
+          <w:b/>
+          <w:bCs/>
+          <w:sz w:val="28"/>
+          <w:szCs w:val="28"/>
+        </w:rPr>
+      </w:pPr>
+      <w:r>
+        <w:rPr>
+          <w:b/>
+          <w:bCs/>
+          <w:sz w:val="28"/>
+          <w:szCs w:val="28"/>
+        </w:rPr>
         <w:t>Window Functions</w:t>
       </w:r>
     </w:p>
@@ -6331,6 +7605,7 @@
           <w:bCs/>
           <w:highlight w:val="yellow"/>
         </w:rPr>
+        <w:lastRenderedPageBreak/>
         <w:t>GROUP BY → reduces rows</w:t>
       </w:r>
       <w:r>
@@ -6408,7 +7683,6 @@
         <w:rPr>
           <w:highlight w:val="yellow"/>
         </w:rPr>
-        <w:lastRenderedPageBreak/>
         <w:t>Even if two rows have the same value, ROW_NUMBER() still gives them different numbers.</w:t>
       </w:r>
     </w:p>
@@ -6603,6 +7877,7 @@
         <w:rPr>
           <w:highlight w:val="yellow"/>
         </w:rPr>
+        <w:lastRenderedPageBreak/>
         <w:t xml:space="preserve">If two or more rows have the same value, they receive the </w:t>
       </w:r>
       <w:r>
@@ -6653,7 +7928,6 @@
         <w:rPr>
           <w:noProof/>
         </w:rPr>
-        <w:lastRenderedPageBreak/>
         <w:drawing>
           <wp:inline distT="0" distB="0" distL="0" distR="0" wp14:anchorId="4CA2C9F1" wp14:editId="1C29FC3E">
             <wp:extent cx="2908449" cy="1670136"/>
@@ -6830,6 +8104,7 @@
         <w:rPr>
           <w:noProof/>
         </w:rPr>
+        <w:lastRenderedPageBreak/>
         <w:drawing>
           <wp:inline distT="0" distB="0" distL="0" distR="0" wp14:anchorId="13B854B7" wp14:editId="62701E5E">
             <wp:extent cx="2889250" cy="1574800"/>
@@ -6885,7 +8160,6 @@
           <w:b/>
           <w:bCs/>
         </w:rPr>
-        <w:lastRenderedPageBreak/>
         <w:t>Short interview answer</w:t>
       </w:r>
     </w:p>
@@ -7036,6 +8310,7 @@
         <w:rPr>
           <w:noProof/>
         </w:rPr>
+        <w:lastRenderedPageBreak/>
         <w:drawing>
           <wp:inline distT="0" distB="0" distL="0" distR="0" wp14:anchorId="2DB7888E" wp14:editId="74FE87B3">
             <wp:extent cx="3486329" cy="1492327"/>
@@ -7114,7 +8389,6 @@
         <w:jc w:val="both"/>
       </w:pPr>
       <w:r>
-        <w:lastRenderedPageBreak/>
         <w:t>OVER(</w:t>
       </w:r>
     </w:p>
@@ -7284,6 +8558,7 @@
           <w:b/>
           <w:bCs/>
         </w:rPr>
+        <w:lastRenderedPageBreak/>
         <w:t>What is LEAD()?</w:t>
       </w:r>
     </w:p>
@@ -7361,7 +8636,6 @@
         <w:ind w:left="360"/>
       </w:pPr>
       <w:r>
-        <w:lastRenderedPageBreak/>
         <w:t xml:space="preserve">       ) AS next_emp_salary</w:t>
       </w:r>
     </w:p>
@@ -7511,6 +8785,7 @@
         <w:ind w:left="360"/>
       </w:pPr>
       <w:r>
+        <w:lastRenderedPageBreak/>
         <w:t>Return the salary from 2 rows ahead; if that row does not exist, return 0.</w:t>
       </w:r>
     </w:p>
@@ -8420,6 +9695,155 @@
     </w:lvl>
   </w:abstractNum>
   <w:abstractNum w:abstractNumId="7" w15:restartNumberingAfterBreak="0">
+    <w:nsid w:val="14D57441"/>
+    <w:multiLevelType w:val="multilevel"/>
+    <w:tmpl w:val="7256C910"/>
+    <w:lvl w:ilvl="0">
+      <w:start w:val="1"/>
+      <w:numFmt w:val="bullet"/>
+      <w:lvlText w:val=""/>
+      <w:lvlJc w:val="left"/>
+      <w:pPr>
+        <w:tabs>
+          <w:tab w:val="num" w:pos="720"/>
+        </w:tabs>
+        <w:ind w:left="720" w:hanging="360"/>
+      </w:pPr>
+      <w:rPr>
+        <w:rFonts w:ascii="Symbol" w:hAnsi="Symbol" w:hint="default"/>
+        <w:sz w:val="20"/>
+      </w:rPr>
+    </w:lvl>
+    <w:lvl w:ilvl="1" w:tentative="1">
+      <w:start w:val="1"/>
+      <w:numFmt w:val="bullet"/>
+      <w:lvlText w:val="o"/>
+      <w:lvlJc w:val="left"/>
+      <w:pPr>
+        <w:tabs>
+          <w:tab w:val="num" w:pos="1440"/>
+        </w:tabs>
+        <w:ind w:left="1440" w:hanging="360"/>
+      </w:pPr>
+      <w:rPr>
+        <w:rFonts w:ascii="Courier New" w:hAnsi="Courier New" w:hint="default"/>
+        <w:sz w:val="20"/>
+      </w:rPr>
+    </w:lvl>
+    <w:lvl w:ilvl="2" w:tentative="1">
+      <w:start w:val="1"/>
+      <w:numFmt w:val="bullet"/>
+      <w:lvlText w:val=""/>
+      <w:lvlJc w:val="left"/>
+      <w:pPr>
+        <w:tabs>
+          <w:tab w:val="num" w:pos="2160"/>
+        </w:tabs>
+        <w:ind w:left="2160" w:hanging="360"/>
+      </w:pPr>
+      <w:rPr>
+        <w:rFonts w:ascii="Wingdings" w:hAnsi="Wingdings" w:hint="default"/>
+        <w:sz w:val="20"/>
+      </w:rPr>
+    </w:lvl>
+    <w:lvl w:ilvl="3" w:tentative="1">
+      <w:start w:val="1"/>
+      <w:numFmt w:val="bullet"/>
+      <w:lvlText w:val=""/>
+      <w:lvlJc w:val="left"/>
+      <w:pPr>
+        <w:tabs>
+          <w:tab w:val="num" w:pos="2880"/>
+        </w:tabs>
+        <w:ind w:left="2880" w:hanging="360"/>
+      </w:pPr>
+      <w:rPr>
+        <w:rFonts w:ascii="Wingdings" w:hAnsi="Wingdings" w:hint="default"/>
+        <w:sz w:val="20"/>
+      </w:rPr>
+    </w:lvl>
+    <w:lvl w:ilvl="4" w:tentative="1">
+      <w:start w:val="1"/>
+      <w:numFmt w:val="bullet"/>
+      <w:lvlText w:val=""/>
+      <w:lvlJc w:val="left"/>
+      <w:pPr>
+        <w:tabs>
+          <w:tab w:val="num" w:pos="3600"/>
+        </w:tabs>
+        <w:ind w:left="3600" w:hanging="360"/>
+      </w:pPr>
+      <w:rPr>
+        <w:rFonts w:ascii="Wingdings" w:hAnsi="Wingdings" w:hint="default"/>
+        <w:sz w:val="20"/>
+      </w:rPr>
+    </w:lvl>
+    <w:lvl w:ilvl="5" w:tentative="1">
+      <w:start w:val="1"/>
+      <w:numFmt w:val="bullet"/>
+      <w:lvlText w:val=""/>
+      <w:lvlJc w:val="left"/>
+      <w:pPr>
+        <w:tabs>
+          <w:tab w:val="num" w:pos="4320"/>
+        </w:tabs>
+        <w:ind w:left="4320" w:hanging="360"/>
+      </w:pPr>
+      <w:rPr>
+        <w:rFonts w:ascii="Wingdings" w:hAnsi="Wingdings" w:hint="default"/>
+        <w:sz w:val="20"/>
+      </w:rPr>
+    </w:lvl>
+    <w:lvl w:ilvl="6" w:tentative="1">
+      <w:start w:val="1"/>
+      <w:numFmt w:val="bullet"/>
+      <w:lvlText w:val=""/>
+      <w:lvlJc w:val="left"/>
+      <w:pPr>
+        <w:tabs>
+          <w:tab w:val="num" w:pos="5040"/>
+        </w:tabs>
+        <w:ind w:left="5040" w:hanging="360"/>
+      </w:pPr>
+      <w:rPr>
+        <w:rFonts w:ascii="Wingdings" w:hAnsi="Wingdings" w:hint="default"/>
+        <w:sz w:val="20"/>
+      </w:rPr>
+    </w:lvl>
+    <w:lvl w:ilvl="7" w:tentative="1">
+      <w:start w:val="1"/>
+      <w:numFmt w:val="bullet"/>
+      <w:lvlText w:val=""/>
+      <w:lvlJc w:val="left"/>
+      <w:pPr>
+        <w:tabs>
+          <w:tab w:val="num" w:pos="5760"/>
+        </w:tabs>
+        <w:ind w:left="5760" w:hanging="360"/>
+      </w:pPr>
+      <w:rPr>
+        <w:rFonts w:ascii="Wingdings" w:hAnsi="Wingdings" w:hint="default"/>
+        <w:sz w:val="20"/>
+      </w:rPr>
+    </w:lvl>
+    <w:lvl w:ilvl="8" w:tentative="1">
+      <w:start w:val="1"/>
+      <w:numFmt w:val="bullet"/>
+      <w:lvlText w:val=""/>
+      <w:lvlJc w:val="left"/>
+      <w:pPr>
+        <w:tabs>
+          <w:tab w:val="num" w:pos="6480"/>
+        </w:tabs>
+        <w:ind w:left="6480" w:hanging="360"/>
+      </w:pPr>
+      <w:rPr>
+        <w:rFonts w:ascii="Wingdings" w:hAnsi="Wingdings" w:hint="default"/>
+        <w:sz w:val="20"/>
+      </w:rPr>
+    </w:lvl>
+  </w:abstractNum>
+  <w:abstractNum w:abstractNumId="8" w15:restartNumberingAfterBreak="0">
     <w:nsid w:val="194F25EE"/>
     <w:multiLevelType w:val="multilevel"/>
     <w:tmpl w:val="CF9E633C"/>
@@ -8568,7 +9992,7 @@
       </w:rPr>
     </w:lvl>
   </w:abstractNum>
-  <w:abstractNum w:abstractNumId="8" w15:restartNumberingAfterBreak="0">
+  <w:abstractNum w:abstractNumId="9" w15:restartNumberingAfterBreak="0">
     <w:nsid w:val="19B86542"/>
     <w:multiLevelType w:val="multilevel"/>
     <w:tmpl w:val="DBA2837C"/>
@@ -8681,7 +10105,7 @@
       </w:pPr>
     </w:lvl>
   </w:abstractNum>
-  <w:abstractNum w:abstractNumId="9" w15:restartNumberingAfterBreak="0">
+  <w:abstractNum w:abstractNumId="10" w15:restartNumberingAfterBreak="0">
     <w:nsid w:val="1B276263"/>
     <w:multiLevelType w:val="multilevel"/>
     <w:tmpl w:val="8EC6A428"/>
@@ -8794,7 +10218,7 @@
       </w:pPr>
     </w:lvl>
   </w:abstractNum>
-  <w:abstractNum w:abstractNumId="10" w15:restartNumberingAfterBreak="0">
+  <w:abstractNum w:abstractNumId="11" w15:restartNumberingAfterBreak="0">
     <w:nsid w:val="1E5E31C8"/>
     <w:multiLevelType w:val="multilevel"/>
     <w:tmpl w:val="E35E15CA"/>
@@ -8907,7 +10331,7 @@
       </w:pPr>
     </w:lvl>
   </w:abstractNum>
-  <w:abstractNum w:abstractNumId="11" w15:restartNumberingAfterBreak="0">
+  <w:abstractNum w:abstractNumId="12" w15:restartNumberingAfterBreak="0">
     <w:nsid w:val="227E62CB"/>
     <w:multiLevelType w:val="multilevel"/>
     <w:tmpl w:val="8C202968"/>
@@ -9020,7 +10444,7 @@
       </w:pPr>
     </w:lvl>
   </w:abstractNum>
-  <w:abstractNum w:abstractNumId="12" w15:restartNumberingAfterBreak="0">
+  <w:abstractNum w:abstractNumId="13" w15:restartNumberingAfterBreak="0">
     <w:nsid w:val="260C63FD"/>
     <w:multiLevelType w:val="multilevel"/>
     <w:tmpl w:val="6E94B40A"/>
@@ -9133,7 +10557,7 @@
       </w:pPr>
     </w:lvl>
   </w:abstractNum>
-  <w:abstractNum w:abstractNumId="13" w15:restartNumberingAfterBreak="0">
+  <w:abstractNum w:abstractNumId="14" w15:restartNumberingAfterBreak="0">
     <w:nsid w:val="26595C2C"/>
     <w:multiLevelType w:val="multilevel"/>
     <w:tmpl w:val="A6EAF85C"/>
@@ -9246,7 +10670,7 @@
       </w:pPr>
     </w:lvl>
   </w:abstractNum>
-  <w:abstractNum w:abstractNumId="14" w15:restartNumberingAfterBreak="0">
+  <w:abstractNum w:abstractNumId="15" w15:restartNumberingAfterBreak="0">
     <w:nsid w:val="28A4629F"/>
     <w:multiLevelType w:val="multilevel"/>
     <w:tmpl w:val="4EDA59EA"/>
@@ -9359,7 +10783,7 @@
       </w:pPr>
     </w:lvl>
   </w:abstractNum>
-  <w:abstractNum w:abstractNumId="15" w15:restartNumberingAfterBreak="0">
+  <w:abstractNum w:abstractNumId="16" w15:restartNumberingAfterBreak="0">
     <w:nsid w:val="2ACB5924"/>
     <w:multiLevelType w:val="multilevel"/>
     <w:tmpl w:val="1C42892C"/>
@@ -9472,7 +10896,7 @@
       </w:pPr>
     </w:lvl>
   </w:abstractNum>
-  <w:abstractNum w:abstractNumId="16" w15:restartNumberingAfterBreak="0">
+  <w:abstractNum w:abstractNumId="17" w15:restartNumberingAfterBreak="0">
     <w:nsid w:val="2E4372D5"/>
     <w:multiLevelType w:val="multilevel"/>
     <w:tmpl w:val="6B24CB0C"/>
@@ -9585,7 +11009,7 @@
       </w:pPr>
     </w:lvl>
   </w:abstractNum>
-  <w:abstractNum w:abstractNumId="17" w15:restartNumberingAfterBreak="0">
+  <w:abstractNum w:abstractNumId="18" w15:restartNumberingAfterBreak="0">
     <w:nsid w:val="2EAB0879"/>
     <w:multiLevelType w:val="multilevel"/>
     <w:tmpl w:val="81E0CE38"/>
@@ -9698,7 +11122,7 @@
       </w:pPr>
     </w:lvl>
   </w:abstractNum>
-  <w:abstractNum w:abstractNumId="18" w15:restartNumberingAfterBreak="0">
+  <w:abstractNum w:abstractNumId="19" w15:restartNumberingAfterBreak="0">
     <w:nsid w:val="385423D3"/>
     <w:multiLevelType w:val="multilevel"/>
     <w:tmpl w:val="F7229806"/>
@@ -9811,7 +11235,7 @@
       </w:pPr>
     </w:lvl>
   </w:abstractNum>
-  <w:abstractNum w:abstractNumId="19" w15:restartNumberingAfterBreak="0">
+  <w:abstractNum w:abstractNumId="20" w15:restartNumberingAfterBreak="0">
     <w:nsid w:val="39010914"/>
     <w:multiLevelType w:val="multilevel"/>
     <w:tmpl w:val="F1B2C8A2"/>
@@ -9924,7 +11348,7 @@
       </w:pPr>
     </w:lvl>
   </w:abstractNum>
-  <w:abstractNum w:abstractNumId="20" w15:restartNumberingAfterBreak="0">
+  <w:abstractNum w:abstractNumId="21" w15:restartNumberingAfterBreak="0">
     <w:nsid w:val="455E6C10"/>
     <w:multiLevelType w:val="multilevel"/>
     <w:tmpl w:val="DD5A65A8"/>
@@ -10037,7 +11461,7 @@
       </w:pPr>
     </w:lvl>
   </w:abstractNum>
-  <w:abstractNum w:abstractNumId="21" w15:restartNumberingAfterBreak="0">
+  <w:abstractNum w:abstractNumId="22" w15:restartNumberingAfterBreak="0">
     <w:nsid w:val="45E112D9"/>
     <w:multiLevelType w:val="multilevel"/>
     <w:tmpl w:val="9F782BE0"/>
@@ -10150,7 +11574,7 @@
       </w:pPr>
     </w:lvl>
   </w:abstractNum>
-  <w:abstractNum w:abstractNumId="22" w15:restartNumberingAfterBreak="0">
+  <w:abstractNum w:abstractNumId="23" w15:restartNumberingAfterBreak="0">
     <w:nsid w:val="4B460275"/>
     <w:multiLevelType w:val="multilevel"/>
     <w:tmpl w:val="D58CEE96"/>
@@ -10263,7 +11687,7 @@
       </w:pPr>
     </w:lvl>
   </w:abstractNum>
-  <w:abstractNum w:abstractNumId="23" w15:restartNumberingAfterBreak="0">
+  <w:abstractNum w:abstractNumId="24" w15:restartNumberingAfterBreak="0">
     <w:nsid w:val="4C0D5FD4"/>
     <w:multiLevelType w:val="multilevel"/>
     <w:tmpl w:val="2DC437D4"/>
@@ -10376,7 +11800,7 @@
       </w:pPr>
     </w:lvl>
   </w:abstractNum>
-  <w:abstractNum w:abstractNumId="24" w15:restartNumberingAfterBreak="0">
+  <w:abstractNum w:abstractNumId="25" w15:restartNumberingAfterBreak="0">
     <w:nsid w:val="4E7E7F1C"/>
     <w:multiLevelType w:val="multilevel"/>
     <w:tmpl w:val="5BC89C12"/>
@@ -10525,7 +11949,7 @@
       </w:rPr>
     </w:lvl>
   </w:abstractNum>
-  <w:abstractNum w:abstractNumId="25" w15:restartNumberingAfterBreak="0">
+  <w:abstractNum w:abstractNumId="26" w15:restartNumberingAfterBreak="0">
     <w:nsid w:val="4F751365"/>
     <w:multiLevelType w:val="multilevel"/>
     <w:tmpl w:val="76724DE8"/>
@@ -10638,7 +12062,7 @@
       </w:pPr>
     </w:lvl>
   </w:abstractNum>
-  <w:abstractNum w:abstractNumId="26" w15:restartNumberingAfterBreak="0">
+  <w:abstractNum w:abstractNumId="27" w15:restartNumberingAfterBreak="0">
     <w:nsid w:val="56FA0182"/>
     <w:multiLevelType w:val="multilevel"/>
     <w:tmpl w:val="322AD6A8"/>
@@ -10751,7 +12175,7 @@
       </w:pPr>
     </w:lvl>
   </w:abstractNum>
-  <w:abstractNum w:abstractNumId="27" w15:restartNumberingAfterBreak="0">
+  <w:abstractNum w:abstractNumId="28" w15:restartNumberingAfterBreak="0">
     <w:nsid w:val="5DC34F05"/>
     <w:multiLevelType w:val="multilevel"/>
     <w:tmpl w:val="5A1AFE68"/>
@@ -10864,7 +12288,7 @@
       </w:pPr>
     </w:lvl>
   </w:abstractNum>
-  <w:abstractNum w:abstractNumId="28" w15:restartNumberingAfterBreak="0">
+  <w:abstractNum w:abstractNumId="29" w15:restartNumberingAfterBreak="0">
     <w:nsid w:val="60F27F47"/>
     <w:multiLevelType w:val="multilevel"/>
     <w:tmpl w:val="3252C3C2"/>
@@ -11013,7 +12437,7 @@
       </w:rPr>
     </w:lvl>
   </w:abstractNum>
-  <w:abstractNum w:abstractNumId="29" w15:restartNumberingAfterBreak="0">
+  <w:abstractNum w:abstractNumId="30" w15:restartNumberingAfterBreak="0">
     <w:nsid w:val="612357C6"/>
     <w:multiLevelType w:val="multilevel"/>
     <w:tmpl w:val="032AD5E0"/>
@@ -11126,7 +12550,7 @@
       </w:pPr>
     </w:lvl>
   </w:abstractNum>
-  <w:abstractNum w:abstractNumId="30" w15:restartNumberingAfterBreak="0">
+  <w:abstractNum w:abstractNumId="31" w15:restartNumberingAfterBreak="0">
     <w:nsid w:val="63FD31D0"/>
     <w:multiLevelType w:val="multilevel"/>
     <w:tmpl w:val="919A58BC"/>
@@ -11239,7 +12663,7 @@
       </w:pPr>
     </w:lvl>
   </w:abstractNum>
-  <w:abstractNum w:abstractNumId="31" w15:restartNumberingAfterBreak="0">
+  <w:abstractNum w:abstractNumId="32" w15:restartNumberingAfterBreak="0">
     <w:nsid w:val="65314ABA"/>
     <w:multiLevelType w:val="multilevel"/>
     <w:tmpl w:val="08C83AAC"/>
@@ -11388,7 +12812,7 @@
       </w:rPr>
     </w:lvl>
   </w:abstractNum>
-  <w:abstractNum w:abstractNumId="32" w15:restartNumberingAfterBreak="0">
+  <w:abstractNum w:abstractNumId="33" w15:restartNumberingAfterBreak="0">
     <w:nsid w:val="7068233E"/>
     <w:multiLevelType w:val="multilevel"/>
     <w:tmpl w:val="76724DE8"/>
@@ -11501,7 +12925,7 @@
       </w:pPr>
     </w:lvl>
   </w:abstractNum>
-  <w:abstractNum w:abstractNumId="33" w15:restartNumberingAfterBreak="0">
+  <w:abstractNum w:abstractNumId="34" w15:restartNumberingAfterBreak="0">
     <w:nsid w:val="71983665"/>
     <w:multiLevelType w:val="multilevel"/>
     <w:tmpl w:val="FF6457B2"/>
@@ -11614,7 +13038,156 @@
       </w:pPr>
     </w:lvl>
   </w:abstractNum>
-  <w:abstractNum w:abstractNumId="34" w15:restartNumberingAfterBreak="0">
+  <w:abstractNum w:abstractNumId="35" w15:restartNumberingAfterBreak="0">
+    <w:nsid w:val="750B061E"/>
+    <w:multiLevelType w:val="multilevel"/>
+    <w:tmpl w:val="9D7ADCD2"/>
+    <w:lvl w:ilvl="0">
+      <w:start w:val="1"/>
+      <w:numFmt w:val="bullet"/>
+      <w:lvlText w:val=""/>
+      <w:lvlJc w:val="left"/>
+      <w:pPr>
+        <w:tabs>
+          <w:tab w:val="num" w:pos="720"/>
+        </w:tabs>
+        <w:ind w:left="720" w:hanging="360"/>
+      </w:pPr>
+      <w:rPr>
+        <w:rFonts w:ascii="Symbol" w:hAnsi="Symbol" w:hint="default"/>
+        <w:sz w:val="20"/>
+      </w:rPr>
+    </w:lvl>
+    <w:lvl w:ilvl="1" w:tentative="1">
+      <w:start w:val="1"/>
+      <w:numFmt w:val="bullet"/>
+      <w:lvlText w:val="o"/>
+      <w:lvlJc w:val="left"/>
+      <w:pPr>
+        <w:tabs>
+          <w:tab w:val="num" w:pos="1440"/>
+        </w:tabs>
+        <w:ind w:left="1440" w:hanging="360"/>
+      </w:pPr>
+      <w:rPr>
+        <w:rFonts w:ascii="Courier New" w:hAnsi="Courier New" w:hint="default"/>
+        <w:sz w:val="20"/>
+      </w:rPr>
+    </w:lvl>
+    <w:lvl w:ilvl="2" w:tentative="1">
+      <w:start w:val="1"/>
+      <w:numFmt w:val="bullet"/>
+      <w:lvlText w:val=""/>
+      <w:lvlJc w:val="left"/>
+      <w:pPr>
+        <w:tabs>
+          <w:tab w:val="num" w:pos="2160"/>
+        </w:tabs>
+        <w:ind w:left="2160" w:hanging="360"/>
+      </w:pPr>
+      <w:rPr>
+        <w:rFonts w:ascii="Wingdings" w:hAnsi="Wingdings" w:hint="default"/>
+        <w:sz w:val="20"/>
+      </w:rPr>
+    </w:lvl>
+    <w:lvl w:ilvl="3" w:tentative="1">
+      <w:start w:val="1"/>
+      <w:numFmt w:val="bullet"/>
+      <w:lvlText w:val=""/>
+      <w:lvlJc w:val="left"/>
+      <w:pPr>
+        <w:tabs>
+          <w:tab w:val="num" w:pos="2880"/>
+        </w:tabs>
+        <w:ind w:left="2880" w:hanging="360"/>
+      </w:pPr>
+      <w:rPr>
+        <w:rFonts w:ascii="Wingdings" w:hAnsi="Wingdings" w:hint="default"/>
+        <w:sz w:val="20"/>
+      </w:rPr>
+    </w:lvl>
+    <w:lvl w:ilvl="4" w:tentative="1">
+      <w:start w:val="1"/>
+      <w:numFmt w:val="bullet"/>
+      <w:lvlText w:val=""/>
+      <w:lvlJc w:val="left"/>
+      <w:pPr>
+        <w:tabs>
+          <w:tab w:val="num" w:pos="3600"/>
+        </w:tabs>
+        <w:ind w:left="3600" w:hanging="360"/>
+      </w:pPr>
+      <w:rPr>
+        <w:rFonts w:ascii="Wingdings" w:hAnsi="Wingdings" w:hint="default"/>
+        <w:sz w:val="20"/>
+      </w:rPr>
+    </w:lvl>
+    <w:lvl w:ilvl="5" w:tentative="1">
+      <w:start w:val="1"/>
+      <w:numFmt w:val="bullet"/>
+      <w:lvlText w:val=""/>
+      <w:lvlJc w:val="left"/>
+      <w:pPr>
+        <w:tabs>
+          <w:tab w:val="num" w:pos="4320"/>
+        </w:tabs>
+        <w:ind w:left="4320" w:hanging="360"/>
+      </w:pPr>
+      <w:rPr>
+        <w:rFonts w:ascii="Wingdings" w:hAnsi="Wingdings" w:hint="default"/>
+        <w:sz w:val="20"/>
+      </w:rPr>
+    </w:lvl>
+    <w:lvl w:ilvl="6" w:tentative="1">
+      <w:start w:val="1"/>
+      <w:numFmt w:val="bullet"/>
+      <w:lvlText w:val=""/>
+      <w:lvlJc w:val="left"/>
+      <w:pPr>
+        <w:tabs>
+          <w:tab w:val="num" w:pos="5040"/>
+        </w:tabs>
+        <w:ind w:left="5040" w:hanging="360"/>
+      </w:pPr>
+      <w:rPr>
+        <w:rFonts w:ascii="Wingdings" w:hAnsi="Wingdings" w:hint="default"/>
+        <w:sz w:val="20"/>
+      </w:rPr>
+    </w:lvl>
+    <w:lvl w:ilvl="7" w:tentative="1">
+      <w:start w:val="1"/>
+      <w:numFmt w:val="bullet"/>
+      <w:lvlText w:val=""/>
+      <w:lvlJc w:val="left"/>
+      <w:pPr>
+        <w:tabs>
+          <w:tab w:val="num" w:pos="5760"/>
+        </w:tabs>
+        <w:ind w:left="5760" w:hanging="360"/>
+      </w:pPr>
+      <w:rPr>
+        <w:rFonts w:ascii="Wingdings" w:hAnsi="Wingdings" w:hint="default"/>
+        <w:sz w:val="20"/>
+      </w:rPr>
+    </w:lvl>
+    <w:lvl w:ilvl="8" w:tentative="1">
+      <w:start w:val="1"/>
+      <w:numFmt w:val="bullet"/>
+      <w:lvlText w:val=""/>
+      <w:lvlJc w:val="left"/>
+      <w:pPr>
+        <w:tabs>
+          <w:tab w:val="num" w:pos="6480"/>
+        </w:tabs>
+        <w:ind w:left="6480" w:hanging="360"/>
+      </w:pPr>
+      <w:rPr>
+        <w:rFonts w:ascii="Wingdings" w:hAnsi="Wingdings" w:hint="default"/>
+        <w:sz w:val="20"/>
+      </w:rPr>
+    </w:lvl>
+  </w:abstractNum>
+  <w:abstractNum w:abstractNumId="36" w15:restartNumberingAfterBreak="0">
     <w:nsid w:val="7F110567"/>
     <w:multiLevelType w:val="multilevel"/>
     <w:tmpl w:val="CD561912"/>
@@ -11764,109 +13337,115 @@
     </w:lvl>
   </w:abstractNum>
   <w:num w:numId="1" w16cid:durableId="1704089216">
-    <w:abstractNumId w:val="17"/>
+    <w:abstractNumId w:val="18"/>
   </w:num>
   <w:num w:numId="2" w16cid:durableId="725876769">
-    <w:abstractNumId w:val="12"/>
+    <w:abstractNumId w:val="13"/>
   </w:num>
   <w:num w:numId="3" w16cid:durableId="1651059778">
-    <w:abstractNumId w:val="8"/>
+    <w:abstractNumId w:val="9"/>
   </w:num>
   <w:num w:numId="4" w16cid:durableId="373046032">
     <w:abstractNumId w:val="5"/>
   </w:num>
   <w:num w:numId="5" w16cid:durableId="451628812">
-    <w:abstractNumId w:val="10"/>
+    <w:abstractNumId w:val="11"/>
   </w:num>
   <w:num w:numId="6" w16cid:durableId="1616057820">
-    <w:abstractNumId w:val="18"/>
+    <w:abstractNumId w:val="19"/>
   </w:num>
   <w:num w:numId="7" w16cid:durableId="1215004143">
-    <w:abstractNumId w:val="26"/>
+    <w:abstractNumId w:val="27"/>
   </w:num>
   <w:num w:numId="8" w16cid:durableId="1948998601">
     <w:abstractNumId w:val="0"/>
   </w:num>
   <w:num w:numId="9" w16cid:durableId="1776710485">
-    <w:abstractNumId w:val="33"/>
+    <w:abstractNumId w:val="34"/>
   </w:num>
   <w:num w:numId="10" w16cid:durableId="258492482">
-    <w:abstractNumId w:val="25"/>
+    <w:abstractNumId w:val="26"/>
   </w:num>
   <w:num w:numId="11" w16cid:durableId="468013383">
-    <w:abstractNumId w:val="20"/>
+    <w:abstractNumId w:val="21"/>
   </w:num>
   <w:num w:numId="12" w16cid:durableId="1166551215">
-    <w:abstractNumId w:val="21"/>
+    <w:abstractNumId w:val="22"/>
   </w:num>
   <w:num w:numId="13" w16cid:durableId="1981768495">
     <w:abstractNumId w:val="4"/>
   </w:num>
   <w:num w:numId="14" w16cid:durableId="885606865">
-    <w:abstractNumId w:val="27"/>
+    <w:abstractNumId w:val="28"/>
   </w:num>
   <w:num w:numId="15" w16cid:durableId="331958671">
-    <w:abstractNumId w:val="9"/>
+    <w:abstractNumId w:val="10"/>
   </w:num>
   <w:num w:numId="16" w16cid:durableId="1361081393">
-    <w:abstractNumId w:val="19"/>
+    <w:abstractNumId w:val="20"/>
   </w:num>
   <w:num w:numId="17" w16cid:durableId="81878272">
-    <w:abstractNumId w:val="23"/>
+    <w:abstractNumId w:val="24"/>
   </w:num>
   <w:num w:numId="18" w16cid:durableId="747962943">
     <w:abstractNumId w:val="2"/>
   </w:num>
   <w:num w:numId="19" w16cid:durableId="1296136884">
-    <w:abstractNumId w:val="22"/>
+    <w:abstractNumId w:val="23"/>
   </w:num>
   <w:num w:numId="20" w16cid:durableId="4017524">
     <w:abstractNumId w:val="6"/>
   </w:num>
   <w:num w:numId="21" w16cid:durableId="473841148">
+    <w:abstractNumId w:val="17"/>
+  </w:num>
+  <w:num w:numId="22" w16cid:durableId="5639109">
+    <w:abstractNumId w:val="12"/>
+  </w:num>
+  <w:num w:numId="23" w16cid:durableId="1679431044">
     <w:abstractNumId w:val="16"/>
   </w:num>
-  <w:num w:numId="22" w16cid:durableId="5639109">
-    <w:abstractNumId w:val="11"/>
-  </w:num>
-  <w:num w:numId="23" w16cid:durableId="1679431044">
-    <w:abstractNumId w:val="15"/>
-  </w:num>
   <w:num w:numId="24" w16cid:durableId="1016538250">
-    <w:abstractNumId w:val="13"/>
+    <w:abstractNumId w:val="14"/>
   </w:num>
   <w:num w:numId="25" w16cid:durableId="239876891">
-    <w:abstractNumId w:val="34"/>
+    <w:abstractNumId w:val="36"/>
   </w:num>
   <w:num w:numId="26" w16cid:durableId="1765614263">
-    <w:abstractNumId w:val="14"/>
+    <w:abstractNumId w:val="15"/>
   </w:num>
   <w:num w:numId="27" w16cid:durableId="620651018">
     <w:abstractNumId w:val="1"/>
   </w:num>
   <w:num w:numId="28" w16cid:durableId="1410231709">
-    <w:abstractNumId w:val="30"/>
+    <w:abstractNumId w:val="31"/>
   </w:num>
   <w:num w:numId="29" w16cid:durableId="971709043">
-    <w:abstractNumId w:val="7"/>
+    <w:abstractNumId w:val="8"/>
   </w:num>
   <w:num w:numId="30" w16cid:durableId="651065738">
-    <w:abstractNumId w:val="31"/>
+    <w:abstractNumId w:val="32"/>
   </w:num>
   <w:num w:numId="31" w16cid:durableId="130098764">
     <w:abstractNumId w:val="3"/>
   </w:num>
   <w:num w:numId="32" w16cid:durableId="1418601543">
+    <w:abstractNumId w:val="30"/>
+  </w:num>
+  <w:num w:numId="33" w16cid:durableId="945427670">
+    <w:abstractNumId w:val="33"/>
+  </w:num>
+  <w:num w:numId="34" w16cid:durableId="1780179236">
+    <w:abstractNumId w:val="25"/>
+  </w:num>
+  <w:num w:numId="35" w16cid:durableId="803427576">
     <w:abstractNumId w:val="29"/>
   </w:num>
-  <w:num w:numId="33" w16cid:durableId="945427670">
-    <w:abstractNumId w:val="32"/>
+  <w:num w:numId="36" w16cid:durableId="1979216379">
+    <w:abstractNumId w:val="7"/>
   </w:num>
-  <w:num w:numId="34" w16cid:durableId="1780179236">
-    <w:abstractNumId w:val="24"/>
-  </w:num>
-  <w:num w:numId="35" w16cid:durableId="803427576">
-    <w:abstractNumId w:val="28"/>
+  <w:num w:numId="37" w16cid:durableId="56246239">
+    <w:abstractNumId w:val="35"/>
   </w:num>
 </w:numbering>
 </file>
@@ -12271,7 +13850,7 @@
   <w:style w:type="paragraph" w:default="1" w:styleId="Normal">
     <w:name w:val="Normal"/>
     <w:qFormat/>
-    <w:rsid w:val="00A1495A"/>
+    <w:rsid w:val="00870B9D"/>
   </w:style>
   <w:style w:type="paragraph" w:styleId="Heading1">
     <w:name w:val="heading 1"/>

</xml_diff>